<commit_message>
Peticao: campos em preto (sem vermelho) e assinatura centralizada
Co-Authored-By: Claude Opus 4.8 <noreply@anthropic.com>
</commit_message>
<xml_diff>
--- a/src/lib/templates/peticao-template.docx
+++ b/src/lib/templates/peticao-template.docx
@@ -529,7 +529,7 @@
             <w:r>
               <w:rPr>
                 <w:rFonts w:ascii="Times New Roman" w:eastAsia="Times New Roman" w:hAnsi="Times New Roman" w:cs="Times New Roman"/>
-                <w:color w:val="FF0000"/>
+                <w:color w:val="000000"/>
                 <w:sz w:val="28"/>
                 <w:szCs w:val="28"/>
                 <w:lang w:eastAsia="pt-BR"/>
@@ -539,7 +539,7 @@
             <w:r>
               <w:rPr>
                 <w:rFonts w:ascii="Times New Roman" w:eastAsia="Times New Roman" w:hAnsi="Times New Roman" w:cs="Times New Roman"/>
-                <w:color w:val="FF0000"/>
+                <w:color w:val="000000"/>
                 <w:sz w:val="28"/>
                 <w:szCs w:val="28"/>
                 <w:lang w:eastAsia="pt-BR"/>
@@ -664,7 +664,7 @@
                 <w:rFonts w:ascii="Times New Roman" w:eastAsia="Times New Roman" w:hAnsi="Times New Roman" w:cs="Times New Roman"/>
                 <w:b/>
                 <w:bCs/>
-                <w:color w:val="FF0000"/>
+                <w:color w:val="000000"/>
                 <w:lang w:eastAsia="pt-BR"/>
               </w:rPr>
             </w:r>
@@ -673,7 +673,7 @@
                 <w:rFonts w:ascii="Times New Roman" w:eastAsia="Times New Roman" w:hAnsi="Times New Roman" w:cs="Times New Roman"/>
                 <w:b/>
                 <w:bCs/>
-                <w:color w:val="FF0000"/>
+                <w:color w:val="000000"/>
                 <w:lang w:eastAsia="pt-BR"/>
               </w:rPr>
             </w:r>
@@ -682,7 +682,7 @@
                 <w:rFonts w:ascii="Times New Roman" w:eastAsia="Times New Roman" w:hAnsi="Times New Roman" w:cs="Times New Roman"/>
                 <w:b/>
                 <w:bCs/>
-                <w:color w:val="FF0000"/>
+                <w:color w:val="000000"/>
                 <w:lang w:eastAsia="pt-BR"/>
               </w:rPr>
             </w:r>
@@ -691,7 +691,7 @@
                 <w:rFonts w:ascii="Times New Roman" w:eastAsia="Times New Roman" w:hAnsi="Times New Roman" w:cs="Times New Roman"/>
                 <w:b/>
                 <w:bCs/>
-                <w:color w:val="FF0000"/>
+                <w:color w:val="000000"/>
                 <w:lang w:eastAsia="pt-BR"/>
               </w:rPr>
             </w:r>
@@ -700,7 +700,7 @@
                 <w:rFonts w:ascii="Times New Roman" w:eastAsia="Times New Roman" w:hAnsi="Times New Roman" w:cs="Times New Roman"/>
                 <w:b/>
                 <w:bCs/>
-                <w:color w:val="FF0000"/>
+                <w:color w:val="000000"/>
                 <w:lang w:eastAsia="pt-BR"/>
               </w:rPr>
             </w:r>
@@ -709,7 +709,7 @@
                 <w:rFonts w:ascii="Times New Roman" w:eastAsia="Times New Roman" w:hAnsi="Times New Roman" w:cs="Times New Roman"/>
                 <w:b/>
                 <w:bCs/>
-                <w:color w:val="FF0000"/>
+                <w:color w:val="000000"/>
                 <w:lang w:eastAsia="pt-BR"/>
               </w:rPr>
             </w:r>
@@ -1171,7 +1171,7 @@
               <w:jc w:val="center"/>
               <w:rPr>
                 <w:rFonts w:ascii="Times New Roman" w:eastAsia="Times New Roman" w:hAnsi="Times New Roman" w:cs="Times New Roman"/>
-                <w:color w:val="FF0000"/>
+                <w:color w:val="000000"/>
                 <w:sz w:val="20"/>
                 <w:szCs w:val="20"/>
                 <w:lang w:eastAsia="pt-BR"/>
@@ -1180,7 +1180,7 @@
             <w:r>
               <w:rPr>
                 <w:rFonts w:ascii="Times New Roman" w:eastAsia="Times New Roman" w:hAnsi="Times New Roman" w:cs="Times New Roman"/>
-                <w:color w:val="FF0000"/>
+                <w:color w:val="000000"/>
                 <w:sz w:val="20"/>
                 <w:szCs w:val="20"/>
                 <w:lang w:eastAsia="pt-BR"/>
@@ -1191,7 +1191,7 @@
             <w:r>
               <w:rPr>
                 <w:rFonts w:ascii="Times New Roman" w:eastAsia="Times New Roman" w:hAnsi="Times New Roman" w:cs="Times New Roman"/>
-                <w:color w:val="FF0000"/>
+                <w:color w:val="000000"/>
                 <w:sz w:val="20"/>
                 <w:szCs w:val="20"/>
                 <w:lang w:eastAsia="pt-BR"/>
@@ -1200,7 +1200,7 @@
             <w:r>
               <w:rPr>
                 <w:rFonts w:ascii="Times New Roman" w:eastAsia="Times New Roman" w:hAnsi="Times New Roman" w:cs="Times New Roman"/>
-                <w:color w:val="FF0000"/>
+                <w:color w:val="000000"/>
                 <w:sz w:val="20"/>
                 <w:szCs w:val="20"/>
                 <w:lang w:eastAsia="pt-BR"/>
@@ -1210,7 +1210,7 @@
             <w:r>
               <w:rPr>
                 <w:rFonts w:ascii="Times New Roman" w:eastAsia="Times New Roman" w:hAnsi="Times New Roman" w:cs="Times New Roman"/>
-                <w:color w:val="FF0000"/>
+                <w:color w:val="000000"/>
                 <w:sz w:val="20"/>
                 <w:szCs w:val="20"/>
                 <w:lang w:eastAsia="pt-BR"/>
@@ -1219,7 +1219,7 @@
             <w:r>
               <w:rPr>
                 <w:rFonts w:ascii="Segoe UI" w:hAnsi="Segoe UI" w:cs="Segoe UI"/>
-                <w:color w:val="FF0000"/>
+                <w:color w:val="000000"/>
                 <w:sz w:val="21"/>
                 <w:szCs w:val="21"/>
               </w:rPr>
@@ -1227,7 +1227,7 @@
             <w:r>
               <w:rPr>
                 <w:rFonts w:ascii="Times New Roman" w:eastAsia="Times New Roman" w:hAnsi="Times New Roman" w:cs="Times New Roman"/>
-                <w:color w:val="FF0000"/>
+                <w:color w:val="000000"/>
                 <w:sz w:val="20"/>
                 <w:szCs w:val="20"/>
                 <w:lang w:eastAsia="pt-BR"/>
@@ -1236,7 +1236,7 @@
             <w:r>
               <w:rPr>
                 <w:rFonts w:ascii="Times New Roman" w:eastAsia="Times New Roman" w:hAnsi="Times New Roman" w:cs="Times New Roman"/>
-                <w:color w:val="FF0000"/>
+                <w:color w:val="000000"/>
                 <w:sz w:val="20"/>
                 <w:szCs w:val="20"/>
                 <w:lang w:eastAsia="pt-BR"/>
@@ -1245,7 +1245,7 @@
             <w:r>
               <w:rPr>
                 <w:rFonts w:ascii="Times New Roman" w:eastAsia="Times New Roman" w:hAnsi="Times New Roman" w:cs="Times New Roman"/>
-                <w:color w:val="FF0000"/>
+                <w:color w:val="000000"/>
                 <w:sz w:val="20"/>
                 <w:szCs w:val="20"/>
                 <w:lang w:eastAsia="pt-BR"/>
@@ -1336,7 +1336,7 @@
               <w:jc w:val="center"/>
               <w:rPr>
                 <w:rFonts w:ascii="Times New Roman" w:eastAsia="Times New Roman" w:hAnsi="Times New Roman" w:cs="Times New Roman"/>
-                <w:color w:val="FF0000"/>
+                <w:color w:val="000000"/>
                 <w:sz w:val="20"/>
                 <w:szCs w:val="20"/>
                 <w:lang w:eastAsia="pt-BR"/>
@@ -1345,7 +1345,7 @@
             <w:r>
               <w:rPr>
                 <w:rFonts w:ascii="Times New Roman" w:eastAsia="Times New Roman" w:hAnsi="Times New Roman" w:cs="Times New Roman"/>
-                <w:color w:val="FF0000"/>
+                <w:color w:val="000000"/>
                 <w:sz w:val="20"/>
                 <w:szCs w:val="20"/>
                 <w:lang w:eastAsia="pt-BR"/>
@@ -1355,7 +1355,7 @@
             <w:r>
               <w:rPr>
                 <w:rFonts w:ascii="Times New Roman" w:eastAsia="Times New Roman" w:hAnsi="Times New Roman" w:cs="Times New Roman"/>
-                <w:color w:val="FF0000"/>
+                <w:color w:val="000000"/>
                 <w:sz w:val="20"/>
                 <w:szCs w:val="20"/>
                 <w:lang w:eastAsia="pt-BR"/>
@@ -1364,7 +1364,7 @@
             <w:r>
               <w:rPr>
                 <w:rFonts w:ascii="Times New Roman" w:eastAsia="Times New Roman" w:hAnsi="Times New Roman" w:cs="Times New Roman"/>
-                <w:color w:val="FF0000"/>
+                <w:color w:val="000000"/>
                 <w:sz w:val="20"/>
                 <w:szCs w:val="20"/>
                 <w:lang w:eastAsia="pt-BR"/>
@@ -1373,7 +1373,7 @@
             <w:r>
               <w:rPr>
                 <w:rFonts w:ascii="Times New Roman" w:eastAsia="Times New Roman" w:hAnsi="Times New Roman" w:cs="Times New Roman"/>
-                <w:color w:val="FF0000"/>
+                <w:color w:val="000000"/>
                 <w:sz w:val="20"/>
                 <w:szCs w:val="20"/>
                 <w:lang w:eastAsia="pt-BR"/>
@@ -1382,7 +1382,7 @@
             <w:r>
               <w:rPr>
                 <w:rFonts w:ascii="Times New Roman" w:eastAsia="Times New Roman" w:hAnsi="Times New Roman" w:cs="Times New Roman"/>
-                <w:color w:val="FF0000"/>
+                <w:color w:val="000000"/>
                 <w:sz w:val="20"/>
                 <w:szCs w:val="20"/>
                 <w:lang w:eastAsia="pt-BR"/>
@@ -1391,7 +1391,7 @@
             <w:r>
               <w:rPr>
                 <w:rFonts w:ascii="Times New Roman" w:eastAsia="Times New Roman" w:hAnsi="Times New Roman" w:cs="Times New Roman"/>
-                <w:color w:val="FF0000"/>
+                <w:color w:val="000000"/>
                 <w:sz w:val="20"/>
                 <w:szCs w:val="20"/>
                 <w:lang w:eastAsia="pt-BR"/>
@@ -1400,7 +1400,7 @@
             <w:r>
               <w:rPr>
                 <w:rFonts w:ascii="Times New Roman" w:eastAsia="Times New Roman" w:hAnsi="Times New Roman" w:cs="Times New Roman"/>
-                <w:color w:val="FF0000"/>
+                <w:color w:val="000000"/>
                 <w:sz w:val="20"/>
                 <w:szCs w:val="20"/>
                 <w:lang w:eastAsia="pt-BR"/>
@@ -1409,7 +1409,7 @@
             <w:r>
               <w:rPr>
                 <w:rFonts w:ascii="Times New Roman" w:eastAsia="Times New Roman" w:hAnsi="Times New Roman" w:cs="Times New Roman"/>
-                <w:color w:val="FF0000"/>
+                <w:color w:val="000000"/>
                 <w:sz w:val="20"/>
                 <w:szCs w:val="20"/>
                 <w:lang w:eastAsia="pt-BR"/>
@@ -1418,7 +1418,7 @@
             <w:r>
               <w:rPr>
                 <w:rFonts w:ascii="Times New Roman" w:eastAsia="Times New Roman" w:hAnsi="Times New Roman" w:cs="Times New Roman"/>
-                <w:color w:val="FF0000"/>
+                <w:color w:val="000000"/>
                 <w:sz w:val="20"/>
                 <w:szCs w:val="20"/>
                 <w:lang w:eastAsia="pt-BR"/>
@@ -1427,7 +1427,7 @@
             <w:r>
               <w:rPr>
                 <w:rFonts w:ascii="Times New Roman" w:eastAsia="Times New Roman" w:hAnsi="Times New Roman" w:cs="Times New Roman"/>
-                <w:color w:val="FF0000"/>
+                <w:color w:val="000000"/>
                 <w:sz w:val="20"/>
                 <w:szCs w:val="20"/>
                 <w:lang w:eastAsia="pt-BR"/>
@@ -1436,7 +1436,7 @@
             <w:r>
               <w:rPr>
                 <w:rFonts w:ascii="Times New Roman" w:eastAsia="Times New Roman" w:hAnsi="Times New Roman" w:cs="Times New Roman"/>
-                <w:color w:val="FF0000"/>
+                <w:color w:val="000000"/>
                 <w:sz w:val="20"/>
                 <w:szCs w:val="20"/>
                 <w:lang w:eastAsia="pt-BR"/>
@@ -1445,7 +1445,7 @@
             <w:r>
               <w:rPr>
                 <w:rFonts w:ascii="Times New Roman" w:eastAsia="Times New Roman" w:hAnsi="Times New Roman" w:cs="Times New Roman"/>
-                <w:color w:val="FF0000"/>
+                <w:color w:val="000000"/>
                 <w:sz w:val="20"/>
                 <w:szCs w:val="20"/>
                 <w:lang w:eastAsia="pt-BR"/>
@@ -1454,7 +1454,7 @@
             <w:r>
               <w:rPr>
                 <w:rFonts w:ascii="Times New Roman" w:eastAsia="Times New Roman" w:hAnsi="Times New Roman" w:cs="Times New Roman"/>
-                <w:color w:val="FF0000"/>
+                <w:color w:val="000000"/>
                 <w:sz w:val="20"/>
                 <w:szCs w:val="20"/>
                 <w:lang w:eastAsia="pt-BR"/>
@@ -1535,7 +1535,7 @@
               <w:jc w:val="center"/>
               <w:rPr>
                 <w:rFonts w:ascii="Times New Roman" w:eastAsia="Times New Roman" w:hAnsi="Times New Roman" w:cs="Times New Roman"/>
-                <w:color w:val="FF0000"/>
+                <w:color w:val="000000"/>
                 <w:sz w:val="20"/>
                 <w:szCs w:val="20"/>
                 <w:lang w:eastAsia="pt-BR"/>
@@ -1544,7 +1544,7 @@
             <w:r>
               <w:rPr>
                 <w:rFonts w:ascii="Times New Roman" w:eastAsia="Times New Roman" w:hAnsi="Times New Roman" w:cs="Times New Roman"/>
-                <w:color w:val="FF0000"/>
+                <w:color w:val="000000"/>
                 <w:sz w:val="20"/>
                 <w:szCs w:val="20"/>
                 <w:lang w:eastAsia="pt-BR"/>
@@ -1554,7 +1554,7 @@
             <w:r>
               <w:rPr>
                 <w:rFonts w:ascii="Times New Roman" w:eastAsia="Times New Roman" w:hAnsi="Times New Roman" w:cs="Times New Roman"/>
-                <w:color w:val="FF0000"/>
+                <w:color w:val="000000"/>
                 <w:sz w:val="20"/>
                 <w:szCs w:val="20"/>
                 <w:lang w:eastAsia="pt-BR"/>
@@ -2353,7 +2353,7 @@
                 <w:rFonts w:asciiTheme="minorHAnsi" w:hAnsiTheme="minorHAnsi" w:cstheme="minorHAnsi"/>
                 <w:b/>
                 <w:bCs/>
-                <w:color w:val="FF0000"/>
+                <w:color w:val="000000"/>
                 <w:sz w:val="16"/>
                 <w:szCs w:val="16"/>
               </w:rPr>
@@ -2363,7 +2363,7 @@
                 <w:rFonts w:asciiTheme="minorHAnsi" w:hAnsiTheme="minorHAnsi" w:cstheme="minorHAnsi"/>
                 <w:b/>
                 <w:bCs/>
-                <w:color w:val="FF0000"/>
+                <w:color w:val="000000"/>
                 <w:sz w:val="16"/>
                 <w:szCs w:val="16"/>
               </w:rPr>
@@ -2383,7 +2383,7 @@
                 <w:rFonts w:asciiTheme="minorHAnsi" w:hAnsiTheme="minorHAnsi" w:cstheme="minorHAnsi"/>
                 <w:b/>
                 <w:bCs/>
-                <w:color w:val="FF0000"/>
+                <w:color w:val="000000"/>
                 <w:sz w:val="16"/>
                 <w:szCs w:val="16"/>
               </w:rPr>
@@ -2393,7 +2393,7 @@
                 <w:rFonts w:asciiTheme="minorHAnsi" w:hAnsiTheme="minorHAnsi" w:cstheme="minorHAnsi"/>
                 <w:b/>
                 <w:bCs/>
-                <w:color w:val="FF0000"/>
+                <w:color w:val="000000"/>
                 <w:sz w:val="16"/>
                 <w:szCs w:val="16"/>
               </w:rPr>
@@ -2413,7 +2413,7 @@
                 <w:rFonts w:asciiTheme="minorHAnsi" w:hAnsiTheme="minorHAnsi" w:cstheme="minorHAnsi"/>
                 <w:b/>
                 <w:bCs/>
-                <w:color w:val="FF0000"/>
+                <w:color w:val="000000"/>
                 <w:sz w:val="16"/>
                 <w:szCs w:val="16"/>
               </w:rPr>
@@ -2423,7 +2423,7 @@
                 <w:rFonts w:asciiTheme="minorHAnsi" w:hAnsiTheme="minorHAnsi" w:cstheme="minorHAnsi"/>
                 <w:b/>
                 <w:bCs/>
-                <w:color w:val="FF0000"/>
+                <w:color w:val="000000"/>
                 <w:sz w:val="16"/>
                 <w:szCs w:val="16"/>
               </w:rPr>
@@ -2443,7 +2443,7 @@
                 <w:rFonts w:asciiTheme="minorHAnsi" w:hAnsiTheme="minorHAnsi" w:cstheme="minorHAnsi"/>
                 <w:b/>
                 <w:bCs/>
-                <w:color w:val="FF0000"/>
+                <w:color w:val="000000"/>
                 <w:sz w:val="16"/>
                 <w:szCs w:val="16"/>
               </w:rPr>
@@ -2453,7 +2453,7 @@
                 <w:rFonts w:asciiTheme="minorHAnsi" w:hAnsiTheme="minorHAnsi" w:cstheme="minorHAnsi"/>
                 <w:b/>
                 <w:bCs/>
-                <w:color w:val="FF0000"/>
+                <w:color w:val="000000"/>
                 <w:sz w:val="16"/>
                 <w:szCs w:val="16"/>
               </w:rPr>
@@ -2473,7 +2473,7 @@
                 <w:rFonts w:asciiTheme="minorHAnsi" w:hAnsiTheme="minorHAnsi" w:cstheme="minorHAnsi"/>
                 <w:b/>
                 <w:bCs/>
-                <w:color w:val="FF0000"/>
+                <w:color w:val="000000"/>
                 <w:sz w:val="16"/>
                 <w:szCs w:val="16"/>
               </w:rPr>
@@ -2483,7 +2483,7 @@
                 <w:rFonts w:asciiTheme="minorHAnsi" w:hAnsiTheme="minorHAnsi" w:cstheme="minorHAnsi"/>
                 <w:b/>
                 <w:bCs/>
-                <w:color w:val="FF0000"/>
+                <w:color w:val="000000"/>
                 <w:sz w:val="16"/>
                 <w:szCs w:val="16"/>
               </w:rPr>
@@ -2517,6 +2517,7 @@
           </w:tcPr>
           <w:p>
             <w:pPr>
+              <w:jc w:val="center"/>
               <w:rPr>
                 <w:rFonts w:ascii="Century Gothic" w:hAnsi="Century Gothic" w:cs="Calibri"/>
                 <w:b/>
@@ -2535,7 +2536,7 @@
                 <w:szCs w:val="18"/>
                 <w:lang w:eastAsia="pt-BR"/>
               </w:rPr>
-              <w:t xml:space="preserve">        </w:t>
+              <w:t xml:space="preserve"/>
             </w:r>
             <w:r>
               <w:rPr>

</xml_diff>

<commit_message>
Peticao: remover pagina em branco no final (paragrafos vazios)
Co-Authored-By: Claude Opus 4.8 <noreply@anthropic.com>
</commit_message>
<xml_diff>
--- a/src/lib/templates/peticao-template.docx
+++ b/src/lib/templates/peticao-template.docx
@@ -3598,54 +3598,6 @@
         </w:tc>
       </w:tr>
     </w:tbl>
-    <w:p>
-      <w:pPr>
-        <w:jc w:val="center"/>
-        <w:rPr>
-          <w:b/>
-          <w:bCs/>
-          <w:sz w:val="28"/>
-          <w:szCs w:val="28"/>
-          <w:u w:val="single"/>
-        </w:rPr>
-      </w:pPr>
-    </w:p>
-    <w:p>
-      <w:pPr>
-        <w:jc w:val="center"/>
-        <w:rPr>
-          <w:b/>
-          <w:bCs/>
-          <w:sz w:val="28"/>
-          <w:szCs w:val="28"/>
-          <w:u w:val="single"/>
-        </w:rPr>
-      </w:pPr>
-    </w:p>
-    <w:p>
-      <w:pPr>
-        <w:jc w:val="center"/>
-        <w:rPr>
-          <w:b/>
-          <w:bCs/>
-          <w:sz w:val="28"/>
-          <w:szCs w:val="28"/>
-          <w:u w:val="single"/>
-        </w:rPr>
-      </w:pPr>
-    </w:p>
-    <w:p>
-      <w:pPr>
-        <w:jc w:val="center"/>
-        <w:rPr>
-          <w:b/>
-          <w:bCs/>
-          <w:sz w:val="28"/>
-          <w:szCs w:val="28"/>
-          <w:u w:val="single"/>
-        </w:rPr>
-      </w:pPr>
-    </w:p>
     <w:p>
       <w:pPr>
         <w:rPr>

</xml_diff>

<commit_message>
Peticao: Relacao de Equipamentos em folha unica (Quant/Lista x2)
Paginas 2-3 viraram uma folha so, no estilo da "Relacao de Material"
oficial: timbrado, titulo centralizado e lista em duas colunas lado a
lado (metade esquerda / metade direita), sem numeracao de item.

Co-Authored-By: Claude Fable 5 <noreply@anthropic.com>
</commit_message>
<xml_diff>
--- a/src/lib/templates/peticao-template.docx
+++ b/src/lib/templates/peticao-template.docx
@@ -2731,133 +2731,17 @@
     </w:tbl>
     <w:p>
       <w:pPr>
+        <w:pStyle w:val="SemEspaamento"/>
         <w:rPr>
-          <w:b/>
-          <w:bCs/>
-          <w:sz w:val="28"/>
-          <w:szCs w:val="28"/>
-          <w:u w:val="single"/>
+          <w:sz w:val="20"/>
         </w:rPr>
       </w:pPr>
-    </w:p>
-    <w:p>
-      <w:pPr>
-        <w:pStyle w:val="SemEspaamento"/>
+      <w:r>
         <w:rPr>
-          <w:b/>
-          <w:bCs/>
-          <w:sz w:val="48"/>
-          <w:szCs w:val="48"/>
+          <w:sz w:val="20"/>
         </w:rPr>
-      </w:pPr>
-    </w:p>
-    <w:p>
-      <w:pPr>
-        <w:pStyle w:val="SemEspaamento"/>
-        <w:jc w:val="center"/>
-        <w:rPr>
-          <w:b/>
-          <w:bCs/>
-          <w:sz w:val="48"/>
-          <w:szCs w:val="48"/>
-        </w:rPr>
-      </w:pPr>
-    </w:p>
-    <w:p>
-      <w:pPr>
-        <w:pStyle w:val="SemEspaamento"/>
-        <w:jc w:val="center"/>
-        <w:rPr>
-          <w:b/>
-          <w:bCs/>
-          <w:sz w:val="48"/>
-          <w:szCs w:val="48"/>
-        </w:rPr>
-      </w:pPr>
-    </w:p>
-    <w:p>
-      <w:pPr>
-        <w:pStyle w:val="SemEspaamento"/>
-        <w:jc w:val="center"/>
-        <w:rPr>
-          <w:b/>
-          <w:bCs/>
-          <w:sz w:val="48"/>
-          <w:szCs w:val="48"/>
-        </w:rPr>
-      </w:pPr>
-    </w:p>
-    <w:p>
-      <w:pPr>
-        <w:pStyle w:val="SemEspaamento"/>
-        <w:jc w:val="center"/>
-        <w:rPr>
-          <w:b/>
-          <w:bCs/>
-          <w:sz w:val="48"/>
-          <w:szCs w:val="48"/>
-        </w:rPr>
-      </w:pPr>
-    </w:p>
-    <w:p>
-      <w:pPr>
-        <w:pStyle w:val="SemEspaamento"/>
-        <w:jc w:val="center"/>
-        <w:rPr>
-          <w:b/>
-          <w:bCs/>
-          <w:sz w:val="48"/>
-          <w:szCs w:val="48"/>
-        </w:rPr>
-      </w:pPr>
-    </w:p>
-    <w:p>
-      <w:pPr>
-        <w:pStyle w:val="SemEspaamento"/>
-        <w:jc w:val="center"/>
-        <w:rPr>
-          <w:b/>
-          <w:bCs/>
-          <w:sz w:val="48"/>
-          <w:szCs w:val="48"/>
-        </w:rPr>
-      </w:pPr>
-    </w:p>
-    <w:p>
-      <w:pPr>
-        <w:pStyle w:val="SemEspaamento"/>
-        <w:jc w:val="center"/>
-        <w:rPr>
-          <w:b/>
-          <w:bCs/>
-          <w:sz w:val="48"/>
-          <w:szCs w:val="48"/>
-        </w:rPr>
-      </w:pPr>
-    </w:p>
-    <w:p>
-      <w:pPr>
-        <w:pStyle w:val="SemEspaamento"/>
-        <w:jc w:val="center"/>
-        <w:rPr>
-          <w:b/>
-          <w:bCs/>
-          <w:sz w:val="48"/>
-          <w:szCs w:val="48"/>
-        </w:rPr>
-      </w:pPr>
-    </w:p>
-    <w:p>
-      <w:pPr>
-        <w:pStyle w:val="SemEspaamento"/>
-        <w:jc w:val="center"/>
-        <w:rPr>
-          <w:b/>
-          <w:bCs/>
-          <w:sz w:val="48"/>
-          <w:szCs w:val="48"/>
-        </w:rPr>
-      </w:pPr>
+        <w:br w:type="page"/>
+      </w:r>
     </w:p>
     <w:tbl>
       <w:tblPr>
@@ -3249,126 +3133,47 @@
       <w:pPr>
         <w:pStyle w:val="SemEspaamento"/>
         <w:rPr>
-          <w:b/>
-          <w:bCs/>
-          <w:sz w:val="48"/>
-          <w:szCs w:val="48"/>
+          <w:sz w:val="20"/>
+          <w:szCs w:val="20"/>
         </w:rPr>
       </w:pPr>
     </w:p>
     <w:p>
       <w:pPr>
         <w:pStyle w:val="SemEspaamento"/>
+        <w:jc w:val="center"/>
         <w:rPr>
           <w:b/>
           <w:bCs/>
-          <w:sz w:val="48"/>
-          <w:szCs w:val="48"/>
+          <w:sz w:val="40"/>
+          <w:szCs w:val="40"/>
         </w:rPr>
       </w:pPr>
       <w:r>
         <w:rPr>
+          <w:rFonts w:ascii="Arial" w:hAnsi="Arial" w:cs="Arial"/>
           <w:b/>
           <w:bCs/>
-          <w:sz w:val="48"/>
-          <w:szCs w:val="48"/>
+          <w:sz w:val="40"/>
+          <w:szCs w:val="40"/>
         </w:rPr>
-        <w:lastRenderedPageBreak/>
-        <w:t>Relação</w:t>
-      </w:r>
-      <w:r>
-        <w:rPr>
-          <w:b/>
-          <w:bCs/>
-          <w:spacing w:val="8"/>
-          <w:sz w:val="48"/>
-          <w:szCs w:val="48"/>
-        </w:rPr>
-        <w:t xml:space="preserve"> </w:t>
-      </w:r>
-      <w:r>
-        <w:rPr>
-          <w:b/>
-          <w:bCs/>
-          <w:sz w:val="48"/>
-          <w:szCs w:val="48"/>
-        </w:rPr>
-        <w:t>de</w:t>
-      </w:r>
-      <w:r>
-        <w:rPr>
-          <w:b/>
-          <w:bCs/>
-          <w:spacing w:val="7"/>
-          <w:sz w:val="48"/>
-          <w:szCs w:val="48"/>
-        </w:rPr>
-        <w:t xml:space="preserve"> </w:t>
-      </w:r>
-      <w:r>
-        <w:rPr>
-          <w:b/>
-          <w:bCs/>
-          <w:sz w:val="48"/>
-          <w:szCs w:val="48"/>
-        </w:rPr>
-        <w:t>Equipamentos</w:t>
-      </w:r>
-      <w:r>
-        <w:rPr>
-          <w:b/>
-          <w:bCs/>
-          <w:spacing w:val="3"/>
-          <w:sz w:val="48"/>
-          <w:szCs w:val="48"/>
-        </w:rPr>
-        <w:t xml:space="preserve"> </w:t>
-      </w:r>
-      <w:r>
-        <w:rPr>
-          <w:b/>
-          <w:bCs/>
-          <w:sz w:val="48"/>
-          <w:szCs w:val="48"/>
-        </w:rPr>
-        <w:t>e</w:t>
-      </w:r>
-      <w:r>
-        <w:rPr>
-          <w:b/>
-          <w:bCs/>
-          <w:spacing w:val="2"/>
-          <w:sz w:val="48"/>
-          <w:szCs w:val="48"/>
-        </w:rPr>
-        <w:t xml:space="preserve"> </w:t>
-      </w:r>
-      <w:r>
-        <w:rPr>
-          <w:b/>
-          <w:bCs/>
-          <w:sz w:val="48"/>
-          <w:szCs w:val="48"/>
-        </w:rPr>
-        <w:t>Materiais</w:t>
+        <w:t>Relação de Equipamentos e Materiais</w:t>
       </w:r>
     </w:p>
     <w:p>
       <w:pPr>
         <w:pStyle w:val="SemEspaamento"/>
         <w:rPr>
-          <w:b/>
-          <w:bCs/>
-          <w:sz w:val="48"/>
-          <w:szCs w:val="48"/>
+          <w:sz w:val="20"/>
+          <w:szCs w:val="20"/>
         </w:rPr>
       </w:pPr>
     </w:p>
     <w:tbl>
       <w:tblPr>
         <w:tblStyle w:val="TableNormal"/>
-        <w:tblW w:w="0" w:type="auto"/>
-        <w:tblInd w:w="125" w:type="dxa"/>
+        <w:tblW w:w="8504" w:type="dxa"/>
+        <w:tblInd w:w="0" w:type="dxa"/>
         <w:tblBorders>
           <w:top w:val="single" w:sz="4" w:space="0" w:color="000000"/>
           <w:left w:val="single" w:sz="4" w:space="0" w:color="000000"/>
@@ -3381,218 +3186,226 @@
         <w:tblLook w:val="01E0" w:firstRow="1" w:lastRow="1" w:firstColumn="1" w:lastColumn="1" w:noHBand="0" w:noVBand="0"/>
       </w:tblPr>
       <w:tblGrid>
-        <w:gridCol w:w="826"/>
-        <w:gridCol w:w="1589"/>
-        <w:gridCol w:w="5926"/>
+        <w:gridCol w:w="1050"/>
+        <w:gridCol w:w="3202"/>
+        <w:gridCol w:w="1050"/>
+        <w:gridCol w:w="3202"/>
       </w:tblGrid>
       <w:tr>
         <w:trPr>
-          <w:trHeight w:val="311"/>
+          <w:trHeight w:val="300"/>
+          <w:tblHeader/>
         </w:trPr>
         <w:tc>
           <w:tcPr>
-            <w:tcW w:w="826" w:type="dxa"/>
+            <w:tcW w:w="1050" w:type="dxa"/>
+            <w:vAlign w:val="center"/>
           </w:tcPr>
           <w:p>
             <w:pPr>
               <w:pStyle w:val="TableParagraph"/>
-              <w:spacing w:line="292" w:lineRule="exact"/>
-              <w:ind w:left="122" w:right="83"/>
-              <w:rPr>
-                <w:b/>
-                <w:sz w:val="27"/>
-              </w:rPr>
-            </w:pPr>
-            <w:r>
-              <w:rPr>
-                <w:b/>
-                <w:sz w:val="27"/>
-                <w:u w:val="thick"/>
-              </w:rPr>
-              <w:t>Itens</w:t>
+              <w:spacing w:line="240" w:lineRule="auto"/>
+              <w:ind w:left="0"/>
+              <w:jc w:val="center"/>
+              <w:rPr>
+                <w:b/>
+                <w:sz w:val="22"/>
+              </w:rPr>
+            </w:pPr>
+            <w:r>
+              <w:rPr>
+                <w:rFonts w:ascii="Arial" w:hAnsi="Arial" w:cs="Arial"/>
+                <w:b/>
+                <w:sz w:val="22"/>
+                <w:szCs w:val="22"/>
+              </w:rPr>
+              <w:t xml:space="preserve">Quant.</w:t>
             </w:r>
           </w:p>
         </w:tc>
         <w:tc>
           <w:tcPr>
-            <w:tcW w:w="1589" w:type="dxa"/>
+            <w:tcW w:w="3202" w:type="dxa"/>
+            <w:vAlign w:val="center"/>
           </w:tcPr>
           <w:p>
             <w:pPr>
               <w:pStyle w:val="TableParagraph"/>
-              <w:spacing w:line="292" w:lineRule="exact"/>
-              <w:ind w:left="117"/>
-              <w:jc w:val="left"/>
-              <w:rPr>
-                <w:b/>
-                <w:sz w:val="27"/>
-              </w:rPr>
-            </w:pPr>
-            <w:r>
-              <w:rPr>
-                <w:b/>
-                <w:sz w:val="27"/>
-                <w:u w:val="thick"/>
-              </w:rPr>
-              <w:t>Quantidade</w:t>
+              <w:spacing w:line="240" w:lineRule="auto"/>
+              <w:ind w:left="0"/>
+              <w:jc w:val="center"/>
+              <w:rPr>
+                <w:b/>
+                <w:sz w:val="22"/>
+              </w:rPr>
+            </w:pPr>
+            <w:r>
+              <w:rPr>
+                <w:rFonts w:ascii="Arial" w:hAnsi="Arial" w:cs="Arial"/>
+                <w:b/>
+                <w:sz w:val="22"/>
+                <w:szCs w:val="22"/>
+              </w:rPr>
+              <w:t xml:space="preserve">Lista</w:t>
             </w:r>
           </w:p>
         </w:tc>
         <w:tc>
           <w:tcPr>
-            <w:tcW w:w="5926" w:type="dxa"/>
+            <w:tcW w:w="1050" w:type="dxa"/>
+            <w:vAlign w:val="center"/>
           </w:tcPr>
           <w:p>
             <w:pPr>
               <w:pStyle w:val="TableParagraph"/>
-              <w:spacing w:line="292" w:lineRule="exact"/>
-              <w:ind w:left="2390" w:right="2361"/>
-              <w:rPr>
-                <w:b/>
-                <w:sz w:val="27"/>
-              </w:rPr>
-            </w:pPr>
-            <w:r>
-              <w:rPr>
-                <w:b/>
-                <w:sz w:val="27"/>
-                <w:u w:val="thick"/>
-              </w:rPr>
-              <w:t>Descrição</w:t>
+              <w:spacing w:line="240" w:lineRule="auto"/>
+              <w:ind w:left="0"/>
+              <w:jc w:val="center"/>
+              <w:rPr>
+                <w:b/>
+                <w:sz w:val="22"/>
+              </w:rPr>
+            </w:pPr>
+            <w:r>
+              <w:rPr>
+                <w:rFonts w:ascii="Arial" w:hAnsi="Arial" w:cs="Arial"/>
+                <w:b/>
+                <w:sz w:val="22"/>
+                <w:szCs w:val="22"/>
+              </w:rPr>
+              <w:t xml:space="preserve">Quant.</w:t>
+            </w:r>
+          </w:p>
+        </w:tc>
+        <w:tc>
+          <w:tcPr>
+            <w:tcW w:w="3202" w:type="dxa"/>
+            <w:vAlign w:val="center"/>
+          </w:tcPr>
+          <w:p>
+            <w:pPr>
+              <w:pStyle w:val="TableParagraph"/>
+              <w:spacing w:line="240" w:lineRule="auto"/>
+              <w:ind w:left="0"/>
+              <w:jc w:val="center"/>
+              <w:rPr>
+                <w:b/>
+                <w:sz w:val="22"/>
+              </w:rPr>
+            </w:pPr>
+            <w:r>
+              <w:rPr>
+                <w:rFonts w:ascii="Arial" w:hAnsi="Arial" w:cs="Arial"/>
+                <w:b/>
+                <w:sz w:val="22"/>
+                <w:szCs w:val="22"/>
+              </w:rPr>
+              <w:t xml:space="preserve">Lista</w:t>
             </w:r>
           </w:p>
         </w:tc>
       </w:tr>
       <w:tr>
         <w:trPr>
-          <w:trHeight w:val="265"/>
+          <w:trHeight w:val="250"/>
         </w:trPr>
         <w:tc>
           <w:tcPr>
-            <w:tcW w:w="826" w:type="dxa"/>
+            <w:tcW w:w="1050" w:type="dxa"/>
+            <w:vAlign w:val="center"/>
           </w:tcPr>
           <w:p>
             <w:pPr>
               <w:pStyle w:val="TableParagraph"/>
-              <w:spacing w:line="246" w:lineRule="exact"/>
-              <w:ind w:left="116" w:right="83"/>
-              <w:rPr>
-                <w:sz w:val="23"/>
-              </w:rPr>
-            </w:pPr>
-            <w:r>
-              <w:rPr>
-                <w:sz w:val="23"/>
-              </w:rPr>
-              <w:t>{#EQUIP}{ITEM}</w:t>
+              <w:spacing w:line="240" w:lineRule="auto"/>
+              <w:ind w:left="0"/>
+              <w:jc w:val="center"/>
+              <w:rPr>
+                <w:sz w:val="20"/>
+              </w:rPr>
+            </w:pPr>
+            <w:r>
+              <w:rPr>
+                <w:rFonts w:ascii="Arial" w:hAnsi="Arial" w:cs="Arial"/>
+                <w:sz w:val="20"/>
+                <w:szCs w:val="20"/>
+              </w:rPr>
+              <w:t xml:space="preserve">{#EQUIP}{QTD_L}</w:t>
             </w:r>
           </w:p>
         </w:tc>
         <w:tc>
           <w:tcPr>
-            <w:tcW w:w="1589" w:type="dxa"/>
+            <w:tcW w:w="3202" w:type="dxa"/>
+            <w:vAlign w:val="center"/>
           </w:tcPr>
           <w:p>
             <w:pPr>
               <w:pStyle w:val="TableParagraph"/>
-              <w:spacing w:line="246" w:lineRule="exact"/>
-              <w:ind w:left="662" w:right="644"/>
-              <w:rPr>
-                <w:sz w:val="23"/>
-              </w:rPr>
-            </w:pPr>
-            <w:r>
-              <w:rPr>
-                <w:sz w:val="23"/>
-              </w:rPr>
-              <w:t>{QTD}</w:t>
+              <w:spacing w:line="240" w:lineRule="auto"/>
+              <w:ind w:left="108"/>
+              <w:jc w:val="left"/>
+              <w:rPr>
+                <w:sz w:val="20"/>
+              </w:rPr>
+            </w:pPr>
+            <w:r>
+              <w:rPr>
+                <w:rFonts w:ascii="Arial" w:hAnsi="Arial" w:cs="Arial"/>
+                <w:sz w:val="20"/>
+                <w:szCs w:val="20"/>
+              </w:rPr>
+              <w:t xml:space="preserve">{DESC_L}</w:t>
             </w:r>
           </w:p>
         </w:tc>
         <w:tc>
           <w:tcPr>
-            <w:tcW w:w="5926" w:type="dxa"/>
+            <w:tcW w:w="1050" w:type="dxa"/>
+            <w:vAlign w:val="center"/>
           </w:tcPr>
           <w:p>
             <w:pPr>
               <w:pStyle w:val="TableParagraph"/>
-              <w:spacing w:line="246" w:lineRule="exact"/>
+              <w:spacing w:line="240" w:lineRule="auto"/>
+              <w:ind w:left="0"/>
+              <w:jc w:val="center"/>
+              <w:rPr>
+                <w:sz w:val="20"/>
+              </w:rPr>
+            </w:pPr>
+            <w:r>
+              <w:rPr>
+                <w:rFonts w:ascii="Arial" w:hAnsi="Arial" w:cs="Arial"/>
+                <w:sz w:val="20"/>
+                <w:szCs w:val="20"/>
+              </w:rPr>
+              <w:t xml:space="preserve">{QTD_R}</w:t>
+            </w:r>
+          </w:p>
+        </w:tc>
+        <w:tc>
+          <w:tcPr>
+            <w:tcW w:w="3202" w:type="dxa"/>
+            <w:vAlign w:val="center"/>
+          </w:tcPr>
+          <w:p>
+            <w:pPr>
+              <w:pStyle w:val="TableParagraph"/>
+              <w:spacing w:line="240" w:lineRule="auto"/>
+              <w:ind w:left="108"/>
               <w:jc w:val="left"/>
               <w:rPr>
-                <w:sz w:val="23"/>
-              </w:rPr>
-            </w:pPr>
-            <w:r>
-              <w:rPr>
-                <w:sz w:val="23"/>
-                <w:u w:val="single"/>
-              </w:rPr>
-              <w:t>{DESC}{/EQUIP}</w:t>
-            </w:r>
-            <w:r>
-              <w:rPr>
-                <w:spacing w:val="-1"/>
-                <w:sz w:val="23"/>
-                <w:u w:val="single"/>
-              </w:rPr>
-            </w:r>
-            <w:r>
-              <w:rPr>
-                <w:sz w:val="23"/>
-                <w:u w:val="single"/>
-              </w:rPr>
-            </w:r>
-            <w:r>
-              <w:rPr>
-                <w:spacing w:val="7"/>
-                <w:sz w:val="23"/>
-                <w:u w:val="single"/>
-              </w:rPr>
-            </w:r>
-            <w:r>
-              <w:rPr>
-                <w:sz w:val="23"/>
-                <w:u w:val="single"/>
-              </w:rPr>
-            </w:r>
-            <w:r>
-              <w:rPr>
-                <w:spacing w:val="6"/>
-                <w:sz w:val="23"/>
-                <w:u w:val="single"/>
-              </w:rPr>
-            </w:r>
-            <w:r>
-              <w:rPr>
-                <w:sz w:val="23"/>
-                <w:u w:val="single"/>
-              </w:rPr>
-            </w:r>
-            <w:r>
-              <w:rPr>
-                <w:spacing w:val="6"/>
-                <w:sz w:val="23"/>
-                <w:u w:val="single"/>
-              </w:rPr>
-            </w:r>
-            <w:r>
-              <w:rPr>
-                <w:sz w:val="23"/>
-                <w:u w:val="single"/>
-              </w:rPr>
-            </w:r>
-            <w:r>
-              <w:rPr>
-                <w:spacing w:val="6"/>
-                <w:sz w:val="23"/>
-                <w:u w:val="single"/>
-              </w:rPr>
-            </w:r>
-            <w:r>
-              <w:rPr>
-                <w:sz w:val="23"/>
-                <w:u w:val="single"/>
-              </w:rPr>
+                <w:sz w:val="20"/>
+              </w:rPr>
+            </w:pPr>
+            <w:r>
+              <w:rPr>
+                <w:rFonts w:ascii="Arial" w:hAnsi="Arial" w:cs="Arial"/>
+                <w:sz w:val="20"/>
+                <w:szCs w:val="20"/>
+              </w:rPr>
+              <w:t xml:space="preserve">{DESC_R}{/EQUIP}</w:t>
             </w:r>
           </w:p>
         </w:tc>

</xml_diff>

<commit_message>
Peticao: cabecalho NASCIMENTO e ISPSCODE sem quebra de linha
Colunas da tabela de funcionarios redistribuidas no template
(NOME/CPF cedem espaco para NASCIMENTO/ISPSCODE), recuos zerados
nesses dois cabecalhos e NASCIMENTO de volta a 12pt.

Co-Authored-By: Claude Fable 5 <noreply@anthropic.com>
</commit_message>
<xml_diff>
--- a/src/lib/templates/peticao-template.docx
+++ b/src/lib/templates/peticao-template.docx
@@ -124,8 +124,21 @@
                 <w:szCs w:val="18"/>
                 <w:lang w:eastAsia="pt-BR"/>
               </w:rPr>
-              <w:t xml:space="preserve">                                      </w:t>
-            </w:r>
+              <w:t xml:space="preserve">                                      Rua: PRAÇA IGUATEMI MARTINS    nº 08, Vila Nova</w:t>
+            </w:r>
+          </w:p>
+          <w:p>
+            <w:pPr>
+              <w:spacing w:after="0" w:line="240" w:lineRule="auto"/>
+              <w:rPr>
+                <w:rFonts w:ascii="Times New Roman" w:eastAsia="Times New Roman" w:hAnsi="Times New Roman" w:cs="Times New Roman"/>
+                <w:b/>
+                <w:color w:val="000000"/>
+                <w:sz w:val="24"/>
+                <w:szCs w:val="24"/>
+                <w:lang w:eastAsia="pt-BR"/>
+              </w:rPr>
+            </w:pPr>
             <w:r>
               <w:rPr>
                 <w:rFonts w:ascii="Century Gothic" w:hAnsi="Century Gothic" w:cs="Calibri"/>
@@ -133,16 +146,27 @@
                 <w:szCs w:val="18"/>
                 <w:lang w:eastAsia="pt-BR"/>
               </w:rPr>
-              <w:t>Rua</w:t>
-            </w:r>
-            <w:r>
+              <w:t xml:space="preserve">                                      Santos /SP –  Cep: 11013-310    </w:t>
+            </w:r>
+          </w:p>
+          <w:p>
+            <w:pPr>
+              <w:spacing w:after="0"/>
               <w:rPr>
                 <w:rFonts w:ascii="Century Gothic" w:hAnsi="Century Gothic" w:cs="Calibri"/>
                 <w:sz w:val="18"/>
                 <w:szCs w:val="18"/>
                 <w:lang w:eastAsia="pt-BR"/>
               </w:rPr>
-              <w:t xml:space="preserve">: </w:t>
+            </w:pPr>
+            <w:r>
+              <w:rPr>
+                <w:rFonts w:ascii="Times New Roman" w:eastAsia="Times New Roman" w:hAnsi="Times New Roman" w:cs="Times New Roman"/>
+                <w:sz w:val="24"/>
+                <w:szCs w:val="24"/>
+                <w:lang w:eastAsia="pt-BR"/>
+              </w:rPr>
+              <w:t xml:space="preserve">                                </w:t>
             </w:r>
             <w:r>
               <w:rPr>
@@ -151,233 +175,7 @@
                 <w:szCs w:val="18"/>
                 <w:lang w:eastAsia="pt-BR"/>
               </w:rPr>
-              <w:t>PRAÇA IGUATEMI MARTINS</w:t>
-            </w:r>
-            <w:r>
-              <w:rPr>
-                <w:rFonts w:ascii="Century Gothic" w:hAnsi="Century Gothic" w:cs="Calibri"/>
-                <w:sz w:val="18"/>
-                <w:szCs w:val="18"/>
-                <w:lang w:eastAsia="pt-BR"/>
-              </w:rPr>
-              <w:t xml:space="preserve"> </w:t>
-            </w:r>
-            <w:r>
-              <w:rPr>
-                <w:rFonts w:ascii="Century Gothic" w:hAnsi="Century Gothic" w:cs="Calibri"/>
-                <w:sz w:val="18"/>
-                <w:szCs w:val="18"/>
-                <w:lang w:eastAsia="pt-BR"/>
-              </w:rPr>
-              <w:t xml:space="preserve"> </w:t>
-            </w:r>
-            <w:r>
-              <w:rPr>
-                <w:rFonts w:ascii="Century Gothic" w:hAnsi="Century Gothic" w:cs="Calibri"/>
-                <w:sz w:val="18"/>
-                <w:szCs w:val="18"/>
-                <w:lang w:eastAsia="pt-BR"/>
-              </w:rPr>
-              <w:t xml:space="preserve"> </w:t>
-            </w:r>
-            <w:r>
-              <w:rPr>
-                <w:rFonts w:ascii="Century Gothic" w:hAnsi="Century Gothic" w:cs="Calibri"/>
-                <w:sz w:val="18"/>
-                <w:szCs w:val="18"/>
-                <w:lang w:eastAsia="pt-BR"/>
-              </w:rPr>
-              <w:t xml:space="preserve"> </w:t>
-            </w:r>
-            <w:r>
-              <w:rPr>
-                <w:rFonts w:ascii="Century Gothic" w:hAnsi="Century Gothic" w:cs="Calibri"/>
-                <w:sz w:val="18"/>
-                <w:szCs w:val="18"/>
-                <w:lang w:eastAsia="pt-BR"/>
-              </w:rPr>
-              <w:t xml:space="preserve">nº </w:t>
-            </w:r>
-            <w:r>
-              <w:rPr>
-                <w:rFonts w:ascii="Century Gothic" w:hAnsi="Century Gothic" w:cs="Calibri"/>
-                <w:sz w:val="18"/>
-                <w:szCs w:val="18"/>
-                <w:lang w:eastAsia="pt-BR"/>
-              </w:rPr>
-              <w:t>08</w:t>
-            </w:r>
-            <w:r>
-              <w:rPr>
-                <w:rFonts w:ascii="Century Gothic" w:hAnsi="Century Gothic" w:cs="Calibri"/>
-                <w:sz w:val="18"/>
-                <w:szCs w:val="18"/>
-                <w:lang w:eastAsia="pt-BR"/>
-              </w:rPr>
-              <w:t>,</w:t>
-            </w:r>
-            <w:r>
-              <w:rPr>
-                <w:rFonts w:ascii="Century Gothic" w:hAnsi="Century Gothic" w:cs="Calibri"/>
-                <w:sz w:val="18"/>
-                <w:szCs w:val="18"/>
-                <w:lang w:eastAsia="pt-BR"/>
-              </w:rPr>
-              <w:t xml:space="preserve"> </w:t>
-            </w:r>
-            <w:r>
-              <w:rPr>
-                <w:rFonts w:ascii="Century Gothic" w:hAnsi="Century Gothic" w:cs="Calibri"/>
-                <w:sz w:val="18"/>
-                <w:szCs w:val="18"/>
-                <w:lang w:eastAsia="pt-BR"/>
-              </w:rPr>
-              <w:t>Vila Nova</w:t>
-            </w:r>
-          </w:p>
-          <w:p>
-            <w:pPr>
-              <w:spacing w:after="0" w:line="240" w:lineRule="auto"/>
-              <w:rPr>
-                <w:rFonts w:ascii="Times New Roman" w:eastAsia="Times New Roman" w:hAnsi="Times New Roman" w:cs="Times New Roman"/>
-                <w:b/>
-                <w:color w:val="000000"/>
-                <w:sz w:val="24"/>
-                <w:szCs w:val="24"/>
-                <w:lang w:eastAsia="pt-BR"/>
-              </w:rPr>
-            </w:pPr>
-            <w:r>
-              <w:rPr>
-                <w:rFonts w:ascii="Century Gothic" w:hAnsi="Century Gothic" w:cs="Calibri"/>
-                <w:sz w:val="18"/>
-                <w:szCs w:val="18"/>
-                <w:lang w:eastAsia="pt-BR"/>
-              </w:rPr>
-              <w:t xml:space="preserve">                                      </w:t>
-            </w:r>
-            <w:r>
-              <w:rPr>
-                <w:rFonts w:ascii="Century Gothic" w:hAnsi="Century Gothic" w:cs="Calibri"/>
-                <w:sz w:val="18"/>
-                <w:szCs w:val="18"/>
-                <w:lang w:eastAsia="pt-BR"/>
-              </w:rPr>
-              <w:t xml:space="preserve">Santos /SP </w:t>
-            </w:r>
-            <w:proofErr w:type="gramStart"/>
-            <w:r>
-              <w:rPr>
-                <w:rFonts w:ascii="Century Gothic" w:hAnsi="Century Gothic" w:cs="Calibri"/>
-                <w:sz w:val="18"/>
-                <w:szCs w:val="18"/>
-                <w:lang w:eastAsia="pt-BR"/>
-              </w:rPr>
-              <w:t>–  Cep</w:t>
-            </w:r>
-            <w:proofErr w:type="gramEnd"/>
-            <w:r>
-              <w:rPr>
-                <w:rFonts w:ascii="Century Gothic" w:hAnsi="Century Gothic" w:cs="Calibri"/>
-                <w:sz w:val="18"/>
-                <w:szCs w:val="18"/>
-                <w:lang w:eastAsia="pt-BR"/>
-              </w:rPr>
-              <w:t xml:space="preserve">: </w:t>
-            </w:r>
-            <w:r>
-              <w:rPr>
-                <w:rFonts w:ascii="Century Gothic" w:hAnsi="Century Gothic" w:cs="Calibri"/>
-                <w:sz w:val="18"/>
-                <w:szCs w:val="18"/>
-                <w:lang w:eastAsia="pt-BR"/>
-              </w:rPr>
-              <w:t>11013-</w:t>
-            </w:r>
-            <w:r>
-              <w:rPr>
-                <w:rFonts w:ascii="Century Gothic" w:hAnsi="Century Gothic" w:cs="Calibri"/>
-                <w:sz w:val="18"/>
-                <w:szCs w:val="18"/>
-                <w:lang w:eastAsia="pt-BR"/>
-              </w:rPr>
-              <w:t>310</w:t>
-            </w:r>
-            <w:r>
-              <w:rPr>
-                <w:rFonts w:ascii="Century Gothic" w:hAnsi="Century Gothic" w:cs="Calibri"/>
-                <w:sz w:val="18"/>
-                <w:szCs w:val="18"/>
-                <w:lang w:eastAsia="pt-BR"/>
-              </w:rPr>
-              <w:t xml:space="preserve">    </w:t>
-            </w:r>
-          </w:p>
-          <w:p>
-            <w:pPr>
-              <w:spacing w:after="0"/>
-              <w:rPr>
-                <w:rFonts w:ascii="Century Gothic" w:hAnsi="Century Gothic" w:cs="Calibri"/>
-                <w:sz w:val="18"/>
-                <w:szCs w:val="18"/>
-                <w:lang w:eastAsia="pt-BR"/>
-              </w:rPr>
-            </w:pPr>
-            <w:r>
-              <w:rPr>
-                <w:rFonts w:ascii="Times New Roman" w:eastAsia="Times New Roman" w:hAnsi="Times New Roman" w:cs="Times New Roman"/>
-                <w:sz w:val="24"/>
-                <w:szCs w:val="24"/>
-                <w:lang w:eastAsia="pt-BR"/>
-              </w:rPr>
-              <w:t xml:space="preserve">                                </w:t>
-            </w:r>
-            <w:r>
-              <w:rPr>
-                <w:rFonts w:ascii="Century Gothic" w:hAnsi="Century Gothic" w:cs="Calibri"/>
-                <w:sz w:val="18"/>
-                <w:szCs w:val="18"/>
-                <w:lang w:eastAsia="pt-BR"/>
-              </w:rPr>
-              <w:t>Tel.</w:t>
-            </w:r>
-            <w:proofErr w:type="gramStart"/>
-            <w:r>
-              <w:rPr>
-                <w:rFonts w:ascii="Century Gothic" w:hAnsi="Century Gothic" w:cs="Calibri"/>
-                <w:sz w:val="18"/>
-                <w:szCs w:val="18"/>
-                <w:lang w:eastAsia="pt-BR"/>
-              </w:rPr>
-              <w:t xml:space="preserve">:  </w:t>
-            </w:r>
-            <w:r>
-              <w:rPr>
-                <w:rFonts w:ascii="Century Gothic" w:hAnsi="Century Gothic" w:cs="Calibri"/>
-                <w:sz w:val="18"/>
-                <w:szCs w:val="18"/>
-                <w:lang w:eastAsia="pt-BR"/>
-              </w:rPr>
-              <w:t>(</w:t>
-            </w:r>
-            <w:proofErr w:type="gramEnd"/>
-            <w:r>
-              <w:rPr>
-                <w:rFonts w:ascii="Century Gothic" w:hAnsi="Century Gothic" w:cs="Calibri"/>
-                <w:sz w:val="18"/>
-                <w:szCs w:val="18"/>
-                <w:lang w:eastAsia="pt-BR"/>
-              </w:rPr>
-              <w:t xml:space="preserve">13) 3385-8481 - </w:t>
-            </w:r>
-            <w:r>
-              <w:rPr>
-                <w:rFonts w:ascii="Century Gothic" w:hAnsi="Century Gothic" w:cs="Calibri"/>
-                <w:sz w:val="18"/>
-                <w:szCs w:val="18"/>
-                <w:lang w:eastAsia="pt-BR"/>
-              </w:rPr>
-              <w:t xml:space="preserve">(13) 98816-2379  </w:t>
+              <w:t xml:space="preserve">Tel.:  (13) 3385-8481 - (13) 98816-2379  </w:t>
             </w:r>
           </w:p>
           <w:p>
@@ -439,34 +237,7 @@
                 <w:szCs w:val="18"/>
                 <w:lang w:val="en-US" w:eastAsia="pt-BR"/>
               </w:rPr>
-              <w:t>CNPJ: 41.560.212/000</w:t>
-            </w:r>
-            <w:r>
-              <w:rPr>
-                <w:rFonts w:ascii="Century Gothic" w:hAnsi="Century Gothic" w:cs="Calibri"/>
-                <w:sz w:val="18"/>
-                <w:szCs w:val="18"/>
-                <w:lang w:val="en-US" w:eastAsia="pt-BR"/>
-              </w:rPr>
-              <w:t>2</w:t>
-            </w:r>
-            <w:r>
-              <w:rPr>
-                <w:rFonts w:ascii="Century Gothic" w:hAnsi="Century Gothic" w:cs="Calibri"/>
-                <w:sz w:val="18"/>
-                <w:szCs w:val="18"/>
-                <w:lang w:val="en-US" w:eastAsia="pt-BR"/>
-              </w:rPr>
-              <w:t xml:space="preserve"> – </w:t>
-            </w:r>
-            <w:r>
-              <w:rPr>
-                <w:rFonts w:ascii="Century Gothic" w:hAnsi="Century Gothic" w:cs="Calibri"/>
-                <w:sz w:val="18"/>
-                <w:szCs w:val="18"/>
-                <w:lang w:val="en-US" w:eastAsia="pt-BR"/>
-              </w:rPr>
-              <w:t>91</w:t>
+              <w:t xml:space="preserve">CNPJ: 41.560.212/0002 – 91</w:t>
             </w:r>
           </w:p>
         </w:tc>
@@ -514,28 +285,6 @@
               </w:rPr>
               <w:t>AUTORIZAÇÃO PARA ACESSO À BARRA</w:t>
             </w:r>
-            <w:proofErr w:type="gramStart"/>
-            <w:r>
-              <w:rPr>
-                <w:rFonts w:ascii="Times New Roman" w:eastAsia="Times New Roman" w:hAnsi="Times New Roman" w:cs="Times New Roman"/>
-                <w:b/>
-                <w:bCs/>
-                <w:color w:val="000000"/>
-                <w:sz w:val="28"/>
-                <w:szCs w:val="28"/>
-                <w:lang w:eastAsia="pt-BR"/>
-              </w:rPr>
-            </w:r>
-            <w:r>
-              <w:rPr>
-                <w:rFonts w:ascii="Times New Roman" w:eastAsia="Times New Roman" w:hAnsi="Times New Roman" w:cs="Times New Roman"/>
-                <w:color w:val="000000"/>
-                <w:sz w:val="28"/>
-                <w:szCs w:val="28"/>
-                <w:lang w:eastAsia="pt-BR"/>
-              </w:rPr>
-            </w:r>
-            <w:proofErr w:type="gramEnd"/>
             <w:r>
               <w:rPr>
                 <w:rFonts w:ascii="Times New Roman" w:eastAsia="Times New Roman" w:hAnsi="Times New Roman" w:cs="Times New Roman"/>
@@ -614,105 +363,6 @@
               </w:rPr>
               <w:t>Ilmo. Sr. Delegado da Alfândega do Porto de Santos                                                                Data     {DATA}</w:t>
             </w:r>
-            <w:r>
-              <w:rPr>
-                <w:rFonts w:ascii="Times New Roman" w:eastAsia="Times New Roman" w:hAnsi="Times New Roman" w:cs="Times New Roman"/>
-                <w:b/>
-                <w:bCs/>
-                <w:color w:val="000000"/>
-                <w:lang w:eastAsia="pt-BR"/>
-              </w:rPr>
-            </w:r>
-            <w:r>
-              <w:rPr>
-                <w:rFonts w:ascii="Times New Roman" w:eastAsia="Times New Roman" w:hAnsi="Times New Roman" w:cs="Times New Roman"/>
-                <w:b/>
-                <w:bCs/>
-                <w:color w:val="000000"/>
-                <w:lang w:eastAsia="pt-BR"/>
-              </w:rPr>
-            </w:r>
-            <w:r>
-              <w:rPr>
-                <w:rFonts w:ascii="Times New Roman" w:eastAsia="Times New Roman" w:hAnsi="Times New Roman" w:cs="Times New Roman"/>
-                <w:b/>
-                <w:bCs/>
-                <w:color w:val="000000"/>
-                <w:lang w:eastAsia="pt-BR"/>
-              </w:rPr>
-            </w:r>
-            <w:r>
-              <w:rPr>
-                <w:rFonts w:ascii="Times New Roman" w:eastAsia="Times New Roman" w:hAnsi="Times New Roman" w:cs="Times New Roman"/>
-                <w:b/>
-                <w:bCs/>
-                <w:color w:val="000000"/>
-                <w:lang w:eastAsia="pt-BR"/>
-              </w:rPr>
-            </w:r>
-            <w:r>
-              <w:rPr>
-                <w:rFonts w:ascii="Times New Roman" w:eastAsia="Times New Roman" w:hAnsi="Times New Roman" w:cs="Times New Roman"/>
-                <w:b/>
-                <w:bCs/>
-                <w:color w:val="000000"/>
-                <w:lang w:eastAsia="pt-BR"/>
-              </w:rPr>
-            </w:r>
-            <w:r>
-              <w:rPr>
-                <w:rFonts w:ascii="Times New Roman" w:eastAsia="Times New Roman" w:hAnsi="Times New Roman" w:cs="Times New Roman"/>
-                <w:b/>
-                <w:bCs/>
-                <w:color w:val="000000"/>
-                <w:lang w:eastAsia="pt-BR"/>
-              </w:rPr>
-            </w:r>
-            <w:r>
-              <w:rPr>
-                <w:rFonts w:ascii="Times New Roman" w:eastAsia="Times New Roman" w:hAnsi="Times New Roman" w:cs="Times New Roman"/>
-                <w:b/>
-                <w:bCs/>
-                <w:color w:val="000000"/>
-                <w:lang w:eastAsia="pt-BR"/>
-              </w:rPr>
-            </w:r>
-            <w:r>
-              <w:rPr>
-                <w:rFonts w:ascii="Times New Roman" w:eastAsia="Times New Roman" w:hAnsi="Times New Roman" w:cs="Times New Roman"/>
-                <w:b/>
-                <w:bCs/>
-                <w:color w:val="000000"/>
-                <w:lang w:eastAsia="pt-BR"/>
-              </w:rPr>
-            </w:r>
-            <w:r>
-              <w:rPr>
-                <w:rFonts w:ascii="Times New Roman" w:eastAsia="Times New Roman" w:hAnsi="Times New Roman" w:cs="Times New Roman"/>
-                <w:b/>
-                <w:bCs/>
-                <w:color w:val="000000"/>
-                <w:lang w:eastAsia="pt-BR"/>
-              </w:rPr>
-            </w:r>
-            <w:r>
-              <w:rPr>
-                <w:rFonts w:ascii="Times New Roman" w:eastAsia="Times New Roman" w:hAnsi="Times New Roman" w:cs="Times New Roman"/>
-                <w:b/>
-                <w:bCs/>
-                <w:color w:val="000000"/>
-                <w:lang w:eastAsia="pt-BR"/>
-              </w:rPr>
-            </w:r>
-            <w:r>
-              <w:rPr>
-                <w:rFonts w:ascii="Times New Roman" w:eastAsia="Times New Roman" w:hAnsi="Times New Roman" w:cs="Times New Roman"/>
-                <w:b/>
-                <w:bCs/>
-                <w:color w:val="000000"/>
-                <w:lang w:eastAsia="pt-BR"/>
-              </w:rPr>
-            </w:r>
           </w:p>
         </w:tc>
         <w:tc>
@@ -792,222 +442,7 @@
                 <w:color w:val="000000"/>
                 <w:lang w:eastAsia="pt-BR"/>
               </w:rPr>
-              <w:t xml:space="preserve">A Cargo </w:t>
-            </w:r>
-            <w:proofErr w:type="spellStart"/>
-            <w:r>
-              <w:rPr>
-                <w:rFonts w:ascii="Times New Roman" w:eastAsia="Times New Roman" w:hAnsi="Times New Roman" w:cs="Times New Roman"/>
-                <w:b/>
-                <w:i/>
-                <w:iCs/>
-                <w:color w:val="000000"/>
-                <w:lang w:eastAsia="pt-BR"/>
-              </w:rPr>
-              <w:t>Ships</w:t>
-            </w:r>
-            <w:proofErr w:type="spellEnd"/>
-            <w:r>
-              <w:rPr>
-                <w:rFonts w:ascii="Times New Roman" w:eastAsia="Times New Roman" w:hAnsi="Times New Roman" w:cs="Times New Roman"/>
-                <w:b/>
-                <w:i/>
-                <w:iCs/>
-                <w:color w:val="000000"/>
-                <w:lang w:eastAsia="pt-BR"/>
-              </w:rPr>
-              <w:t xml:space="preserve"> </w:t>
-            </w:r>
-            <w:proofErr w:type="spellStart"/>
-            <w:r>
-              <w:rPr>
-                <w:rFonts w:ascii="Times New Roman" w:eastAsia="Times New Roman" w:hAnsi="Times New Roman" w:cs="Times New Roman"/>
-                <w:b/>
-                <w:i/>
-                <w:iCs/>
-                <w:color w:val="000000"/>
-                <w:lang w:eastAsia="pt-BR"/>
-              </w:rPr>
-              <w:t>Cleaning</w:t>
-            </w:r>
-            <w:proofErr w:type="spellEnd"/>
-            <w:r>
-              <w:rPr>
-                <w:rFonts w:ascii="Times New Roman" w:eastAsia="Times New Roman" w:hAnsi="Times New Roman" w:cs="Times New Roman"/>
-                <w:b/>
-                <w:i/>
-                <w:iCs/>
-                <w:color w:val="000000"/>
-                <w:lang w:eastAsia="pt-BR"/>
-              </w:rPr>
-              <w:t xml:space="preserve"> </w:t>
-            </w:r>
-            <w:proofErr w:type="gramStart"/>
-            <w:r>
-              <w:rPr>
-                <w:rFonts w:ascii="Times New Roman" w:eastAsia="Times New Roman" w:hAnsi="Times New Roman" w:cs="Times New Roman"/>
-                <w:b/>
-                <w:i/>
-                <w:iCs/>
-                <w:color w:val="000000"/>
-                <w:lang w:eastAsia="pt-BR"/>
-              </w:rPr>
-              <w:t>Ltda</w:t>
-            </w:r>
-            <w:r>
-              <w:rPr>
-                <w:rFonts w:ascii="Times New Roman" w:eastAsia="Times New Roman" w:hAnsi="Times New Roman" w:cs="Times New Roman"/>
-                <w:b/>
-                <w:i/>
-                <w:iCs/>
-                <w:color w:val="000000"/>
-                <w:lang w:eastAsia="pt-BR"/>
-              </w:rPr>
-              <w:t xml:space="preserve"> ,</w:t>
-            </w:r>
-            <w:proofErr w:type="gramEnd"/>
-            <w:r>
-              <w:rPr>
-                <w:rFonts w:ascii="Times New Roman" w:eastAsia="Times New Roman" w:hAnsi="Times New Roman" w:cs="Times New Roman"/>
-                <w:b/>
-                <w:i/>
-                <w:iCs/>
-                <w:color w:val="000000"/>
-                <w:lang w:eastAsia="pt-BR"/>
-              </w:rPr>
-              <w:t xml:space="preserve"> situada na </w:t>
-            </w:r>
-            <w:r>
-              <w:rPr>
-                <w:rFonts w:ascii="Times New Roman" w:eastAsia="Times New Roman" w:hAnsi="Times New Roman" w:cs="Times New Roman"/>
-                <w:b/>
-                <w:i/>
-                <w:iCs/>
-                <w:color w:val="000000"/>
-                <w:lang w:eastAsia="pt-BR"/>
-              </w:rPr>
-              <w:t xml:space="preserve">Praça Iguatemi Martins n° 8, </w:t>
-            </w:r>
-            <w:r>
-              <w:rPr>
-                <w:rFonts w:ascii="Times New Roman" w:eastAsia="Times New Roman" w:hAnsi="Times New Roman" w:cs="Times New Roman"/>
-                <w:b/>
-                <w:i/>
-                <w:iCs/>
-                <w:color w:val="000000"/>
-                <w:lang w:eastAsia="pt-BR"/>
-              </w:rPr>
-              <w:t xml:space="preserve"> Santos</w:t>
-            </w:r>
-            <w:r>
-              <w:rPr>
-                <w:rFonts w:ascii="Times New Roman" w:eastAsia="Times New Roman" w:hAnsi="Times New Roman" w:cs="Times New Roman"/>
-                <w:b/>
-                <w:i/>
-                <w:iCs/>
-                <w:color w:val="000000"/>
-                <w:lang w:eastAsia="pt-BR"/>
-              </w:rPr>
-              <w:t xml:space="preserve">-Vila Nova </w:t>
-            </w:r>
-            <w:r>
-              <w:rPr>
-                <w:rFonts w:ascii="Times New Roman" w:eastAsia="Times New Roman" w:hAnsi="Times New Roman" w:cs="Times New Roman"/>
-                <w:b/>
-                <w:i/>
-                <w:iCs/>
-                <w:color w:val="000000"/>
-                <w:lang w:eastAsia="pt-BR"/>
-              </w:rPr>
-              <w:t>, inscrita no CNPJ 41.560.212/000</w:t>
-            </w:r>
-            <w:r>
-              <w:rPr>
-                <w:rFonts w:ascii="Times New Roman" w:eastAsia="Times New Roman" w:hAnsi="Times New Roman" w:cs="Times New Roman"/>
-                <w:b/>
-                <w:i/>
-                <w:iCs/>
-                <w:color w:val="000000"/>
-                <w:lang w:eastAsia="pt-BR"/>
-              </w:rPr>
-              <w:t>2</w:t>
-            </w:r>
-            <w:r>
-              <w:rPr>
-                <w:rFonts w:ascii="Times New Roman" w:eastAsia="Times New Roman" w:hAnsi="Times New Roman" w:cs="Times New Roman"/>
-                <w:b/>
-                <w:i/>
-                <w:iCs/>
-                <w:color w:val="000000"/>
-                <w:lang w:eastAsia="pt-BR"/>
-              </w:rPr>
-              <w:t>-</w:t>
-            </w:r>
-            <w:r>
-              <w:rPr>
-                <w:rFonts w:ascii="Times New Roman" w:eastAsia="Times New Roman" w:hAnsi="Times New Roman" w:cs="Times New Roman"/>
-                <w:b/>
-                <w:i/>
-                <w:iCs/>
-                <w:color w:val="000000"/>
-                <w:lang w:eastAsia="pt-BR"/>
-              </w:rPr>
-              <w:t>91</w:t>
-            </w:r>
-            <w:r>
-              <w:rPr>
-                <w:rFonts w:ascii="Times New Roman" w:eastAsia="Times New Roman" w:hAnsi="Times New Roman" w:cs="Times New Roman"/>
-                <w:b/>
-                <w:i/>
-                <w:iCs/>
-                <w:color w:val="000000"/>
-                <w:lang w:eastAsia="pt-BR"/>
-              </w:rPr>
-              <w:t>,</w:t>
-            </w:r>
-            <w:r>
-              <w:rPr>
-                <w:rFonts w:ascii="Times New Roman" w:eastAsia="Times New Roman" w:hAnsi="Times New Roman" w:cs="Times New Roman"/>
-                <w:b/>
-                <w:i/>
-                <w:iCs/>
-                <w:color w:val="000000"/>
-                <w:lang w:eastAsia="pt-BR"/>
-              </w:rPr>
-              <w:t xml:space="preserve"> com o telefone (13 ) 3385-8481, </w:t>
-            </w:r>
-            <w:r>
-              <w:rPr>
-                <w:rFonts w:ascii="Times New Roman" w:eastAsia="Times New Roman" w:hAnsi="Times New Roman" w:cs="Times New Roman"/>
-                <w:b/>
-                <w:i/>
-                <w:iCs/>
-                <w:color w:val="000000"/>
-                <w:lang w:eastAsia="pt-BR"/>
-              </w:rPr>
-              <w:t xml:space="preserve"> solicita a V.Sas. autorização para acesso </w:t>
-            </w:r>
-            <w:r>
-              <w:rPr>
-                <w:rFonts w:ascii="Times New Roman" w:eastAsia="Times New Roman" w:hAnsi="Times New Roman" w:cs="Times New Roman"/>
-                <w:b/>
-                <w:i/>
-                <w:iCs/>
-                <w:color w:val="000000"/>
-                <w:lang w:eastAsia="pt-BR"/>
-              </w:rPr>
-              <w:t>à</w:t>
-            </w:r>
-            <w:r>
-              <w:rPr>
-                <w:rFonts w:ascii="Times New Roman" w:eastAsia="Times New Roman" w:hAnsi="Times New Roman" w:cs="Times New Roman"/>
-                <w:b/>
-                <w:i/>
-                <w:iCs/>
-                <w:color w:val="000000"/>
-                <w:lang w:eastAsia="pt-BR"/>
-              </w:rPr>
-              <w:t xml:space="preserve"> barra.</w:t>
+              <w:t xml:space="preserve">A Cargo Ships Cleaning Ltda , situada na Praça Iguatemi Martins n° 8,  Santos-Vila Nova , inscrita no CNPJ 41.560.212/0002-91, com o telefone (13 ) 3385-8481,  solicita a V.Sas. autorização para acesso à barra.</w:t>
             </w:r>
           </w:p>
         </w:tc>
@@ -1049,15 +484,6 @@
                 <w:lang w:eastAsia="pt-BR"/>
               </w:rPr>
               <w:t>Motivo: {MOTIVO}</w:t>
-            </w:r>
-            <w:r>
-              <w:rPr>
-                <w:rFonts w:ascii="Times New Roman" w:eastAsia="Times New Roman" w:hAnsi="Times New Roman" w:cs="Times New Roman"/>
-                <w:color w:val="000000"/>
-                <w:sz w:val="28"/>
-                <w:szCs w:val="28"/>
-                <w:lang w:eastAsia="pt-BR"/>
-              </w:rPr>
             </w:r>
           </w:p>
         </w:tc>
@@ -1136,17 +562,7 @@
                 <w:szCs w:val="28"/>
                 <w:lang w:eastAsia="pt-BR"/>
               </w:rPr>
-              <w:t>Navio / Bandeira /IMO</w:t>
-            </w:r>
-            <w:r>
-              <w:rPr>
-                <w:rFonts w:ascii="Times New Roman" w:eastAsia="Times New Roman" w:hAnsi="Times New Roman" w:cs="Times New Roman"/>
-                <w:color w:val="000000"/>
-                <w:sz w:val="28"/>
-                <w:szCs w:val="28"/>
-                <w:lang w:eastAsia="pt-BR"/>
-              </w:rPr>
-              <w:t>:</w:t>
+              <w:t>Navio / Bandeira /IMO:</w:t>
             </w:r>
           </w:p>
         </w:tc>
@@ -1187,59 +603,12 @@
               </w:rPr>
               <w:t>{NAVIO}</w:t>
             </w:r>
-            <w:proofErr w:type="gramStart"/>
-            <w:r>
-              <w:rPr>
-                <w:rFonts w:ascii="Times New Roman" w:eastAsia="Times New Roman" w:hAnsi="Times New Roman" w:cs="Times New Roman"/>
-                <w:color w:val="000000"/>
-                <w:sz w:val="20"/>
-                <w:szCs w:val="20"/>
-                <w:lang w:eastAsia="pt-BR"/>
-              </w:rPr>
-            </w:r>
-            <w:r>
-              <w:rPr>
-                <w:rFonts w:ascii="Times New Roman" w:eastAsia="Times New Roman" w:hAnsi="Times New Roman" w:cs="Times New Roman"/>
-                <w:color w:val="000000"/>
-                <w:sz w:val="20"/>
-                <w:szCs w:val="20"/>
-                <w:lang w:eastAsia="pt-BR"/>
-              </w:rPr>
-            </w:r>
-            <w:proofErr w:type="gramEnd"/>
-            <w:r>
-              <w:rPr>
-                <w:rFonts w:ascii="Times New Roman" w:eastAsia="Times New Roman" w:hAnsi="Times New Roman" w:cs="Times New Roman"/>
-                <w:color w:val="000000"/>
-                <w:sz w:val="20"/>
-                <w:szCs w:val="20"/>
-                <w:lang w:eastAsia="pt-BR"/>
-              </w:rPr>
-            </w:r>
             <w:r>
               <w:rPr>
                 <w:rFonts w:ascii="Segoe UI" w:hAnsi="Segoe UI" w:cs="Segoe UI"/>
                 <w:color w:val="000000"/>
                 <w:sz w:val="21"/>
                 <w:szCs w:val="21"/>
-              </w:rPr>
-            </w:r>
-            <w:r>
-              <w:rPr>
-                <w:rFonts w:ascii="Times New Roman" w:eastAsia="Times New Roman" w:hAnsi="Times New Roman" w:cs="Times New Roman"/>
-                <w:color w:val="000000"/>
-                <w:sz w:val="20"/>
-                <w:szCs w:val="20"/>
-                <w:lang w:eastAsia="pt-BR"/>
-              </w:rPr>
-            </w:r>
-            <w:r>
-              <w:rPr>
-                <w:rFonts w:ascii="Times New Roman" w:eastAsia="Times New Roman" w:hAnsi="Times New Roman" w:cs="Times New Roman"/>
-                <w:color w:val="000000"/>
-                <w:sz w:val="20"/>
-                <w:szCs w:val="20"/>
-                <w:lang w:eastAsia="pt-BR"/>
               </w:rPr>
             </w:r>
             <w:r>
@@ -1291,27 +660,7 @@
                 <w:szCs w:val="28"/>
                 <w:lang w:eastAsia="pt-BR"/>
               </w:rPr>
-              <w:t>Per</w:t>
-            </w:r>
-            <w:r>
-              <w:rPr>
-                <w:rFonts w:ascii="Times New Roman" w:eastAsia="Times New Roman" w:hAnsi="Times New Roman" w:cs="Times New Roman"/>
-                <w:color w:val="000000"/>
-                <w:sz w:val="28"/>
-                <w:szCs w:val="28"/>
-                <w:lang w:eastAsia="pt-BR"/>
-              </w:rPr>
-              <w:t>í</w:t>
-            </w:r>
-            <w:r>
-              <w:rPr>
-                <w:rFonts w:ascii="Times New Roman" w:eastAsia="Times New Roman" w:hAnsi="Times New Roman" w:cs="Times New Roman"/>
-                <w:color w:val="000000"/>
-                <w:sz w:val="28"/>
-                <w:szCs w:val="28"/>
-                <w:lang w:eastAsia="pt-BR"/>
-              </w:rPr>
-              <w:t>odo:</w:t>
+              <w:t>Período:</w:t>
             </w:r>
           </w:p>
         </w:tc>
@@ -1352,114 +701,6 @@
               </w:rPr>
               <w:t>{PERIODO}</w:t>
             </w:r>
-            <w:r>
-              <w:rPr>
-                <w:rFonts w:ascii="Times New Roman" w:eastAsia="Times New Roman" w:hAnsi="Times New Roman" w:cs="Times New Roman"/>
-                <w:color w:val="000000"/>
-                <w:sz w:val="20"/>
-                <w:szCs w:val="20"/>
-                <w:lang w:eastAsia="pt-BR"/>
-              </w:rPr>
-            </w:r>
-            <w:r>
-              <w:rPr>
-                <w:rFonts w:ascii="Times New Roman" w:eastAsia="Times New Roman" w:hAnsi="Times New Roman" w:cs="Times New Roman"/>
-                <w:color w:val="000000"/>
-                <w:sz w:val="20"/>
-                <w:szCs w:val="20"/>
-                <w:lang w:eastAsia="pt-BR"/>
-              </w:rPr>
-            </w:r>
-            <w:r>
-              <w:rPr>
-                <w:rFonts w:ascii="Times New Roman" w:eastAsia="Times New Roman" w:hAnsi="Times New Roman" w:cs="Times New Roman"/>
-                <w:color w:val="000000"/>
-                <w:sz w:val="20"/>
-                <w:szCs w:val="20"/>
-                <w:lang w:eastAsia="pt-BR"/>
-              </w:rPr>
-            </w:r>
-            <w:r>
-              <w:rPr>
-                <w:rFonts w:ascii="Times New Roman" w:eastAsia="Times New Roman" w:hAnsi="Times New Roman" w:cs="Times New Roman"/>
-                <w:color w:val="000000"/>
-                <w:sz w:val="20"/>
-                <w:szCs w:val="20"/>
-                <w:lang w:eastAsia="pt-BR"/>
-              </w:rPr>
-            </w:r>
-            <w:r>
-              <w:rPr>
-                <w:rFonts w:ascii="Times New Roman" w:eastAsia="Times New Roman" w:hAnsi="Times New Roman" w:cs="Times New Roman"/>
-                <w:color w:val="000000"/>
-                <w:sz w:val="20"/>
-                <w:szCs w:val="20"/>
-                <w:lang w:eastAsia="pt-BR"/>
-              </w:rPr>
-            </w:r>
-            <w:r>
-              <w:rPr>
-                <w:rFonts w:ascii="Times New Roman" w:eastAsia="Times New Roman" w:hAnsi="Times New Roman" w:cs="Times New Roman"/>
-                <w:color w:val="000000"/>
-                <w:sz w:val="20"/>
-                <w:szCs w:val="20"/>
-                <w:lang w:eastAsia="pt-BR"/>
-              </w:rPr>
-            </w:r>
-            <w:r>
-              <w:rPr>
-                <w:rFonts w:ascii="Times New Roman" w:eastAsia="Times New Roman" w:hAnsi="Times New Roman" w:cs="Times New Roman"/>
-                <w:color w:val="000000"/>
-                <w:sz w:val="20"/>
-                <w:szCs w:val="20"/>
-                <w:lang w:eastAsia="pt-BR"/>
-              </w:rPr>
-            </w:r>
-            <w:r>
-              <w:rPr>
-                <w:rFonts w:ascii="Times New Roman" w:eastAsia="Times New Roman" w:hAnsi="Times New Roman" w:cs="Times New Roman"/>
-                <w:color w:val="000000"/>
-                <w:sz w:val="20"/>
-                <w:szCs w:val="20"/>
-                <w:lang w:eastAsia="pt-BR"/>
-              </w:rPr>
-            </w:r>
-            <w:r>
-              <w:rPr>
-                <w:rFonts w:ascii="Times New Roman" w:eastAsia="Times New Roman" w:hAnsi="Times New Roman" w:cs="Times New Roman"/>
-                <w:color w:val="000000"/>
-                <w:sz w:val="20"/>
-                <w:szCs w:val="20"/>
-                <w:lang w:eastAsia="pt-BR"/>
-              </w:rPr>
-            </w:r>
-            <w:r>
-              <w:rPr>
-                <w:rFonts w:ascii="Times New Roman" w:eastAsia="Times New Roman" w:hAnsi="Times New Roman" w:cs="Times New Roman"/>
-                <w:color w:val="000000"/>
-                <w:sz w:val="20"/>
-                <w:szCs w:val="20"/>
-                <w:lang w:eastAsia="pt-BR"/>
-              </w:rPr>
-            </w:r>
-            <w:r>
-              <w:rPr>
-                <w:rFonts w:ascii="Times New Roman" w:eastAsia="Times New Roman" w:hAnsi="Times New Roman" w:cs="Times New Roman"/>
-                <w:color w:val="000000"/>
-                <w:sz w:val="20"/>
-                <w:szCs w:val="20"/>
-                <w:lang w:eastAsia="pt-BR"/>
-              </w:rPr>
-            </w:r>
-            <w:r>
-              <w:rPr>
-                <w:rFonts w:ascii="Times New Roman" w:eastAsia="Times New Roman" w:hAnsi="Times New Roman" w:cs="Times New Roman"/>
-                <w:color w:val="000000"/>
-                <w:sz w:val="20"/>
-                <w:szCs w:val="20"/>
-                <w:lang w:eastAsia="pt-BR"/>
-              </w:rPr>
-            </w:r>
           </w:p>
         </w:tc>
       </w:tr>
@@ -1500,17 +741,7 @@
                 <w:szCs w:val="28"/>
                 <w:lang w:eastAsia="pt-BR"/>
               </w:rPr>
-              <w:t>Agência</w:t>
-            </w:r>
-            <w:r>
-              <w:rPr>
-                <w:rFonts w:ascii="Times New Roman" w:eastAsia="Times New Roman" w:hAnsi="Times New Roman" w:cs="Times New Roman"/>
-                <w:color w:val="000000"/>
-                <w:sz w:val="28"/>
-                <w:szCs w:val="28"/>
-                <w:lang w:eastAsia="pt-BR"/>
-              </w:rPr>
-              <w:t>:</w:t>
+              <w:t>Agência:</w:t>
             </w:r>
           </w:p>
         </w:tc>
@@ -1551,15 +782,6 @@
               </w:rPr>
               <w:t>{AGENCIA}</w:t>
             </w:r>
-            <w:r>
-              <w:rPr>
-                <w:rFonts w:ascii="Times New Roman" w:eastAsia="Times New Roman" w:hAnsi="Times New Roman" w:cs="Times New Roman"/>
-                <w:color w:val="000000"/>
-                <w:sz w:val="20"/>
-                <w:szCs w:val="20"/>
-                <w:lang w:eastAsia="pt-BR"/>
-              </w:rPr>
-            </w:r>
           </w:p>
         </w:tc>
       </w:tr>
@@ -1600,27 +822,7 @@
                 <w:szCs w:val="28"/>
                 <w:lang w:eastAsia="pt-BR"/>
               </w:rPr>
-              <w:t>Meio de Transporte</w:t>
-            </w:r>
-            <w:r>
-              <w:rPr>
-                <w:rFonts w:ascii="Times New Roman" w:eastAsia="Times New Roman" w:hAnsi="Times New Roman" w:cs="Times New Roman"/>
-                <w:color w:val="000000"/>
-                <w:sz w:val="28"/>
-                <w:szCs w:val="28"/>
-                <w:lang w:eastAsia="pt-BR"/>
-              </w:rPr>
-              <w:t>:</w:t>
-            </w:r>
-            <w:r>
-              <w:rPr>
-                <w:rFonts w:ascii="Times New Roman" w:eastAsia="Times New Roman" w:hAnsi="Times New Roman" w:cs="Times New Roman"/>
-                <w:color w:val="000000"/>
-                <w:sz w:val="28"/>
-                <w:szCs w:val="28"/>
-                <w:lang w:eastAsia="pt-BR"/>
-              </w:rPr>
-              <w:t xml:space="preserve"> </w:t>
+              <w:t xml:space="preserve">Meio de Transporte: </w:t>
             </w:r>
           </w:p>
         </w:tc>
@@ -1661,55 +863,6 @@
               </w:rPr>
               <w:t>{TRANSPORTE}</w:t>
             </w:r>
-            <w:proofErr w:type="spellStart"/>
-            <w:r>
-              <w:rPr>
-                <w:rFonts w:ascii="Times New Roman" w:eastAsia="Times New Roman" w:hAnsi="Times New Roman" w:cs="Times New Roman"/>
-                <w:color w:val="000000"/>
-                <w:sz w:val="20"/>
-                <w:szCs w:val="20"/>
-                <w:lang w:eastAsia="pt-BR"/>
-              </w:rPr>
-            </w:r>
-            <w:proofErr w:type="spellEnd"/>
-            <w:r>
-              <w:rPr>
-                <w:rFonts w:ascii="Times New Roman" w:eastAsia="Times New Roman" w:hAnsi="Times New Roman" w:cs="Times New Roman"/>
-                <w:color w:val="000000"/>
-                <w:sz w:val="20"/>
-                <w:szCs w:val="20"/>
-                <w:lang w:eastAsia="pt-BR"/>
-              </w:rPr>
-            </w:r>
-            <w:proofErr w:type="spellStart"/>
-            <w:r>
-              <w:rPr>
-                <w:rFonts w:ascii="Times New Roman" w:eastAsia="Times New Roman" w:hAnsi="Times New Roman" w:cs="Times New Roman"/>
-                <w:color w:val="000000"/>
-                <w:sz w:val="20"/>
-                <w:szCs w:val="20"/>
-                <w:lang w:eastAsia="pt-BR"/>
-              </w:rPr>
-            </w:r>
-            <w:proofErr w:type="spellEnd"/>
-            <w:r>
-              <w:rPr>
-                <w:rFonts w:ascii="Times New Roman" w:eastAsia="Times New Roman" w:hAnsi="Times New Roman" w:cs="Times New Roman"/>
-                <w:color w:val="000000"/>
-                <w:sz w:val="20"/>
-                <w:szCs w:val="20"/>
-                <w:lang w:eastAsia="pt-BR"/>
-              </w:rPr>
-            </w:r>
-            <w:r>
-              <w:rPr>
-                <w:rFonts w:ascii="Times New Roman" w:eastAsia="Times New Roman" w:hAnsi="Times New Roman" w:cs="Times New Roman"/>
-                <w:color w:val="000000"/>
-                <w:sz w:val="20"/>
-                <w:szCs w:val="20"/>
-                <w:lang w:eastAsia="pt-BR"/>
-              </w:rPr>
-            </w:r>
           </w:p>
         </w:tc>
       </w:tr>
@@ -1750,17 +903,7 @@
                 <w:szCs w:val="28"/>
                 <w:lang w:eastAsia="pt-BR"/>
               </w:rPr>
-              <w:t>Local de Embarque dos Prestadores dos Serviços</w:t>
-            </w:r>
-            <w:r>
-              <w:rPr>
-                <w:rFonts w:ascii="Times New Roman" w:eastAsia="Times New Roman" w:hAnsi="Times New Roman" w:cs="Times New Roman"/>
-                <w:color w:val="000000"/>
-                <w:sz w:val="28"/>
-                <w:szCs w:val="28"/>
-                <w:lang w:eastAsia="pt-BR"/>
-              </w:rPr>
-              <w:t>:</w:t>
+              <w:t>Local de Embarque dos Prestadores dos Serviços:</w:t>
             </w:r>
           </w:p>
         </w:tc>
@@ -1801,15 +944,6 @@
               </w:rPr>
               <w:t>{GATE}</w:t>
             </w:r>
-            <w:r>
-              <w:rPr>
-                <w:rFonts w:ascii="Times New Roman" w:eastAsia="Times New Roman" w:hAnsi="Times New Roman" w:cs="Times New Roman"/>
-                <w:color w:val="000000"/>
-                <w:sz w:val="20"/>
-                <w:szCs w:val="20"/>
-                <w:lang w:eastAsia="pt-BR"/>
-              </w:rPr>
-            </w:r>
           </w:p>
         </w:tc>
       </w:tr>
@@ -1891,24 +1025,6 @@
               </w:rPr>
               <w:t>{GATE}</w:t>
             </w:r>
-            <w:r>
-              <w:rPr>
-                <w:rFonts w:ascii="Times New Roman" w:eastAsia="Times New Roman" w:hAnsi="Times New Roman" w:cs="Times New Roman"/>
-                <w:color w:val="000000"/>
-                <w:sz w:val="20"/>
-                <w:szCs w:val="20"/>
-                <w:lang w:eastAsia="pt-BR"/>
-              </w:rPr>
-            </w:r>
-            <w:r>
-              <w:rPr>
-                <w:rFonts w:ascii="Times New Roman" w:eastAsia="Times New Roman" w:hAnsi="Times New Roman" w:cs="Times New Roman"/>
-                <w:color w:val="000000"/>
-                <w:sz w:val="20"/>
-                <w:szCs w:val="20"/>
-                <w:lang w:eastAsia="pt-BR"/>
-              </w:rPr>
-            </w:r>
           </w:p>
         </w:tc>
       </w:tr>
@@ -1990,24 +1106,6 @@
               </w:rPr>
               <w:t>{GATE}</w:t>
             </w:r>
-            <w:r>
-              <w:rPr>
-                <w:rFonts w:ascii="Times New Roman" w:eastAsia="Times New Roman" w:hAnsi="Times New Roman" w:cs="Times New Roman"/>
-                <w:color w:val="000000"/>
-                <w:sz w:val="20"/>
-                <w:szCs w:val="20"/>
-                <w:lang w:eastAsia="pt-BR"/>
-              </w:rPr>
-            </w:r>
-            <w:r>
-              <w:rPr>
-                <w:rFonts w:ascii="Times New Roman" w:eastAsia="Times New Roman" w:hAnsi="Times New Roman" w:cs="Times New Roman"/>
-                <w:color w:val="000000"/>
-                <w:sz w:val="20"/>
-                <w:szCs w:val="20"/>
-                <w:lang w:eastAsia="pt-BR"/>
-              </w:rPr>
-            </w:r>
           </w:p>
         </w:tc>
       </w:tr>
@@ -2047,17 +1145,7 @@
                 <w:szCs w:val="28"/>
                 <w:lang w:eastAsia="pt-BR"/>
               </w:rPr>
-              <w:t>Local de Desembarque dos Equipamentos</w:t>
-            </w:r>
-            <w:r>
-              <w:rPr>
-                <w:rFonts w:ascii="Times New Roman" w:eastAsia="Times New Roman" w:hAnsi="Times New Roman" w:cs="Times New Roman"/>
-                <w:color w:val="000000"/>
-                <w:sz w:val="28"/>
-                <w:szCs w:val="28"/>
-                <w:lang w:eastAsia="pt-BR"/>
-              </w:rPr>
-              <w:t>:</w:t>
+              <w:t>Local de Desembarque dos Equipamentos:</w:t>
             </w:r>
           </w:p>
         </w:tc>
@@ -2118,11 +1206,11 @@
         <w:tblLook w:val="01E0" w:firstRow="1" w:lastRow="1" w:firstColumn="1" w:lastColumn="1" w:noHBand="0" w:noVBand="0"/>
       </w:tblPr>
       <w:tblGrid>
-        <w:gridCol w:w="3544"/>
-        <w:gridCol w:w="1843"/>
+        <w:gridCol w:w="3202"/>
+        <w:gridCol w:w="1560"/>
         <w:gridCol w:w="1559"/>
-        <w:gridCol w:w="1560"/>
-        <w:gridCol w:w="1417"/>
+        <w:gridCol w:w="1900"/>
+        <w:gridCol w:w="1702"/>
       </w:tblGrid>
       <w:tr>
         <w:trPr>
@@ -2130,7 +1218,7 @@
         </w:trPr>
         <w:tc>
           <w:tcPr>
-            <w:tcW w:w="3544" w:type="dxa"/>
+            <w:tcW w:w="3202" w:type="dxa"/>
           </w:tcPr>
           <w:p>
             <w:pPr>
@@ -2168,7 +1256,7 @@
         </w:tc>
         <w:tc>
           <w:tcPr>
-            <w:tcW w:w="1843" w:type="dxa"/>
+            <w:tcW w:w="1560" w:type="dxa"/>
           </w:tcPr>
           <w:p>
             <w:pPr>
@@ -2240,60 +1328,12 @@
         </w:tc>
         <w:tc>
           <w:tcPr>
-            <w:tcW w:w="1560" w:type="dxa"/>
+            <w:tcW w:w="1900" w:type="dxa"/>
           </w:tcPr>
           <w:p>
             <w:pPr>
               <w:pStyle w:val="TableParagraph"/>
-              <w:ind w:left="200" w:right="177"/>
-              <w:rPr>
-                <w:rFonts w:asciiTheme="minorHAnsi" w:hAnsiTheme="minorHAnsi" w:cstheme="minorHAnsi"/>
-                <w:b/>
-                <w:color w:val="262626" w:themeColor="text1" w:themeTint="D9"/>
-                <w:sz w:val="20"/>
-                <w:szCs w:val="20"/>
-                <w14:shadow w14:blurRad="0" w14:dist="38100" w14:dir="2700000" w14:sx="100000" w14:sy="100000" w14:kx="0" w14:ky="0" w14:algn="bl">
-                  <w14:schemeClr w14:val="accent5"/>
-                </w14:shadow>
-                <w14:textOutline w14:w="6731" w14:cap="flat" w14:cmpd="sng" w14:algn="ctr">
-                  <w14:solidFill>
-                    <w14:schemeClr w14:val="bg1"/>
-                  </w14:solidFill>
-                  <w14:prstDash w14:val="solid"/>
-                  <w14:round/>
-                </w14:textOutline>
-              </w:rPr>
-            </w:pPr>
-            <w:r>
-              <w:rPr>
-                <w:rFonts w:asciiTheme="minorHAnsi" w:hAnsiTheme="minorHAnsi" w:cstheme="minorHAnsi"/>
-                <w:b/>
-                <w:color w:val="262626" w:themeColor="text1" w:themeTint="D9"/>
-                <w:sz w:val="20"/>
-                <w:szCs w:val="20"/>
-                <w14:shadow w14:blurRad="0" w14:dist="38100" w14:dir="2700000" w14:sx="100000" w14:sy="100000" w14:kx="0" w14:ky="0" w14:algn="bl">
-                  <w14:schemeClr w14:val="accent5"/>
-                </w14:shadow>
-                <w14:textOutline w14:w="6731" w14:cap="flat" w14:cmpd="sng" w14:algn="ctr">
-                  <w14:solidFill>
-                    <w14:schemeClr w14:val="bg1"/>
-                  </w14:solidFill>
-                  <w14:prstDash w14:val="solid"/>
-                  <w14:round/>
-                </w14:textOutline>
-              </w:rPr>
-              <w:t>NASCIMENTO</w:t>
-            </w:r>
-          </w:p>
-        </w:tc>
-        <w:tc>
-          <w:tcPr>
-            <w:tcW w:w="1417" w:type="dxa"/>
-          </w:tcPr>
-          <w:p>
-            <w:pPr>
-              <w:pStyle w:val="TableParagraph"/>
-              <w:ind w:left="200" w:right="177"/>
+              <w:ind w:left="0" w:right="0"/>
               <w:rPr>
                 <w:rFonts w:asciiTheme="minorHAnsi" w:hAnsiTheme="minorHAnsi" w:cstheme="minorHAnsi"/>
                 <w:b/>
@@ -2330,6 +1370,54 @@
                   <w14:round/>
                 </w14:textOutline>
               </w:rPr>
+              <w:t>NASCIMENTO</w:t>
+            </w:r>
+          </w:p>
+        </w:tc>
+        <w:tc>
+          <w:tcPr>
+            <w:tcW w:w="1702" w:type="dxa"/>
+          </w:tcPr>
+          <w:p>
+            <w:pPr>
+              <w:pStyle w:val="TableParagraph"/>
+              <w:ind w:left="0" w:right="0"/>
+              <w:rPr>
+                <w:rFonts w:asciiTheme="minorHAnsi" w:hAnsiTheme="minorHAnsi" w:cstheme="minorHAnsi"/>
+                <w:b/>
+                <w:color w:val="262626" w:themeColor="text1" w:themeTint="D9"/>
+                <w:sz w:val="24"/>
+                <w:szCs w:val="24"/>
+                <w14:shadow w14:blurRad="0" w14:dist="38100" w14:dir="2700000" w14:sx="100000" w14:sy="100000" w14:kx="0" w14:ky="0" w14:algn="bl">
+                  <w14:schemeClr w14:val="accent5"/>
+                </w14:shadow>
+                <w14:textOutline w14:w="6731" w14:cap="flat" w14:cmpd="sng" w14:algn="ctr">
+                  <w14:solidFill>
+                    <w14:schemeClr w14:val="bg1"/>
+                  </w14:solidFill>
+                  <w14:prstDash w14:val="solid"/>
+                  <w14:round/>
+                </w14:textOutline>
+              </w:rPr>
+            </w:pPr>
+            <w:r>
+              <w:rPr>
+                <w:rFonts w:asciiTheme="minorHAnsi" w:hAnsiTheme="minorHAnsi" w:cstheme="minorHAnsi"/>
+                <w:b/>
+                <w:color w:val="262626" w:themeColor="text1" w:themeTint="D9"/>
+                <w:sz w:val="24"/>
+                <w:szCs w:val="24"/>
+                <w14:shadow w14:blurRad="0" w14:dist="38100" w14:dir="2700000" w14:sx="100000" w14:sy="100000" w14:kx="0" w14:ky="0" w14:algn="bl">
+                  <w14:schemeClr w14:val="accent5"/>
+                </w14:shadow>
+                <w14:textOutline w14:w="6731" w14:cap="flat" w14:cmpd="sng" w14:algn="ctr">
+                  <w14:solidFill>
+                    <w14:schemeClr w14:val="bg1"/>
+                  </w14:solidFill>
+                  <w14:prstDash w14:val="solid"/>
+                  <w14:round/>
+                </w14:textOutline>
+              </w:rPr>
               <w:t>ISPSCODE</w:t>
             </w:r>
           </w:p>
@@ -2341,7 +1429,7 @@
         </w:trPr>
         <w:tc>
           <w:tcPr>
-            <w:tcW w:w="3544" w:type="dxa"/>
+            <w:tcW w:w="3202" w:type="dxa"/>
           </w:tcPr>
           <w:p>
             <w:pPr>
@@ -2373,7 +1461,7 @@
         </w:tc>
         <w:tc>
           <w:tcPr>
-            <w:tcW w:w="1843" w:type="dxa"/>
+            <w:tcW w:w="1560" w:type="dxa"/>
           </w:tcPr>
           <w:p>
             <w:pPr>
@@ -2433,7 +1521,7 @@
         </w:tc>
         <w:tc>
           <w:tcPr>
-            <w:tcW w:w="1560" w:type="dxa"/>
+            <w:tcW w:w="1900" w:type="dxa"/>
           </w:tcPr>
           <w:p>
             <w:pPr>
@@ -2463,7 +1551,7 @@
         </w:tc>
         <w:tc>
           <w:tcPr>
-            <w:tcW w:w="1417" w:type="dxa"/>
+            <w:tcW w:w="1702" w:type="dxa"/>
           </w:tcPr>
           <w:p>
             <w:pPr>
@@ -2536,40 +1624,7 @@
                 <w:szCs w:val="18"/>
                 <w:lang w:eastAsia="pt-BR"/>
               </w:rPr>
-              <w:t xml:space="preserve"/>
-            </w:r>
-            <w:r>
-              <w:rPr>
-                <w:rFonts w:ascii="Century Gothic" w:hAnsi="Century Gothic" w:cs="Calibri"/>
-                <w:b/>
-                <w:bCs/>
-                <w:sz w:val="18"/>
-                <w:szCs w:val="18"/>
-                <w:lang w:eastAsia="pt-BR"/>
-              </w:rPr>
-              <w:t>ASSINATUR</w:t>
-            </w:r>
-            <w:r>
-              <w:rPr>
-                <w:rFonts w:ascii="Century Gothic" w:hAnsi="Century Gothic" w:cs="Calibri"/>
-                <w:b/>
-                <w:bCs/>
-                <w:sz w:val="18"/>
-                <w:szCs w:val="18"/>
-                <w:lang w:eastAsia="pt-BR"/>
-              </w:rPr>
-              <w:t>A</w:t>
-            </w:r>
-            <w:r>
-              <w:rPr>
-                <w:rFonts w:ascii="Century Gothic" w:hAnsi="Century Gothic" w:cs="Calibri"/>
-                <w:b/>
-                <w:bCs/>
-                <w:sz w:val="18"/>
-                <w:szCs w:val="18"/>
-                <w:lang w:eastAsia="pt-BR"/>
-              </w:rPr>
-              <w:t xml:space="preserve"> DO SOLICITANTE</w:t>
+              <w:t xml:space="preserve">ASSINATURA DO SOLICITANTE</w:t>
             </w:r>
           </w:p>
           <w:p>
@@ -2862,8 +1917,21 @@
                 <w:szCs w:val="18"/>
                 <w:lang w:eastAsia="pt-BR"/>
               </w:rPr>
-              <w:t xml:space="preserve">                                      </w:t>
-            </w:r>
+              <w:t xml:space="preserve">                                      Rua: PRAÇA IGUATEMI MARTINS    nº 08, Vila Nova</w:t>
+            </w:r>
+          </w:p>
+          <w:p>
+            <w:pPr>
+              <w:spacing w:after="0" w:line="240" w:lineRule="auto"/>
+              <w:rPr>
+                <w:rFonts w:ascii="Times New Roman" w:eastAsia="Times New Roman" w:hAnsi="Times New Roman" w:cs="Times New Roman"/>
+                <w:b/>
+                <w:color w:val="000000"/>
+                <w:sz w:val="24"/>
+                <w:szCs w:val="24"/>
+                <w:lang w:eastAsia="pt-BR"/>
+              </w:rPr>
+            </w:pPr>
             <w:r>
               <w:rPr>
                 <w:rFonts w:ascii="Century Gothic" w:hAnsi="Century Gothic" w:cs="Calibri"/>
@@ -2871,16 +1939,27 @@
                 <w:szCs w:val="18"/>
                 <w:lang w:eastAsia="pt-BR"/>
               </w:rPr>
-              <w:t>Rua</w:t>
-            </w:r>
-            <w:r>
+              <w:t xml:space="preserve">                                      Santos /SP –  Cep: 11013-310    </w:t>
+            </w:r>
+          </w:p>
+          <w:p>
+            <w:pPr>
+              <w:spacing w:after="0"/>
               <w:rPr>
                 <w:rFonts w:ascii="Century Gothic" w:hAnsi="Century Gothic" w:cs="Calibri"/>
                 <w:sz w:val="18"/>
                 <w:szCs w:val="18"/>
                 <w:lang w:eastAsia="pt-BR"/>
               </w:rPr>
-              <w:t xml:space="preserve">: PRAÇA IGUATEMI MARTINS    </w:t>
+            </w:pPr>
+            <w:r>
+              <w:rPr>
+                <w:rFonts w:ascii="Times New Roman" w:eastAsia="Times New Roman" w:hAnsi="Times New Roman" w:cs="Times New Roman"/>
+                <w:sz w:val="24"/>
+                <w:szCs w:val="24"/>
+                <w:lang w:eastAsia="pt-BR"/>
+              </w:rPr>
+              <w:t xml:space="preserve">                                </w:t>
             </w:r>
             <w:r>
               <w:rPr>
@@ -2889,152 +1968,7 @@
                 <w:szCs w:val="18"/>
                 <w:lang w:eastAsia="pt-BR"/>
               </w:rPr>
-              <w:t xml:space="preserve">nº </w:t>
-            </w:r>
-            <w:r>
-              <w:rPr>
-                <w:rFonts w:ascii="Century Gothic" w:hAnsi="Century Gothic" w:cs="Calibri"/>
-                <w:sz w:val="18"/>
-                <w:szCs w:val="18"/>
-                <w:lang w:eastAsia="pt-BR"/>
-              </w:rPr>
-              <w:t>08,</w:t>
-            </w:r>
-            <w:r>
-              <w:rPr>
-                <w:rFonts w:ascii="Century Gothic" w:hAnsi="Century Gothic" w:cs="Calibri"/>
-                <w:sz w:val="18"/>
-                <w:szCs w:val="18"/>
-                <w:lang w:eastAsia="pt-BR"/>
-              </w:rPr>
-              <w:t xml:space="preserve"> </w:t>
-            </w:r>
-            <w:r>
-              <w:rPr>
-                <w:rFonts w:ascii="Century Gothic" w:hAnsi="Century Gothic" w:cs="Calibri"/>
-                <w:sz w:val="18"/>
-                <w:szCs w:val="18"/>
-                <w:lang w:eastAsia="pt-BR"/>
-              </w:rPr>
-              <w:t>Vila Nova</w:t>
-            </w:r>
-          </w:p>
-          <w:p>
-            <w:pPr>
-              <w:spacing w:after="0" w:line="240" w:lineRule="auto"/>
-              <w:rPr>
-                <w:rFonts w:ascii="Times New Roman" w:eastAsia="Times New Roman" w:hAnsi="Times New Roman" w:cs="Times New Roman"/>
-                <w:b/>
-                <w:color w:val="000000"/>
-                <w:sz w:val="24"/>
-                <w:szCs w:val="24"/>
-                <w:lang w:eastAsia="pt-BR"/>
-              </w:rPr>
-            </w:pPr>
-            <w:r>
-              <w:rPr>
-                <w:rFonts w:ascii="Century Gothic" w:hAnsi="Century Gothic" w:cs="Calibri"/>
-                <w:sz w:val="18"/>
-                <w:szCs w:val="18"/>
-                <w:lang w:eastAsia="pt-BR"/>
-              </w:rPr>
-              <w:t xml:space="preserve">                                      </w:t>
-            </w:r>
-            <w:r>
-              <w:rPr>
-                <w:rFonts w:ascii="Century Gothic" w:hAnsi="Century Gothic" w:cs="Calibri"/>
-                <w:sz w:val="18"/>
-                <w:szCs w:val="18"/>
-                <w:lang w:eastAsia="pt-BR"/>
-              </w:rPr>
-              <w:t xml:space="preserve">Santos /SP </w:t>
-            </w:r>
-            <w:proofErr w:type="gramStart"/>
-            <w:r>
-              <w:rPr>
-                <w:rFonts w:ascii="Century Gothic" w:hAnsi="Century Gothic" w:cs="Calibri"/>
-                <w:sz w:val="18"/>
-                <w:szCs w:val="18"/>
-                <w:lang w:eastAsia="pt-BR"/>
-              </w:rPr>
-              <w:t>–  Cep</w:t>
-            </w:r>
-            <w:proofErr w:type="gramEnd"/>
-            <w:r>
-              <w:rPr>
-                <w:rFonts w:ascii="Century Gothic" w:hAnsi="Century Gothic" w:cs="Calibri"/>
-                <w:sz w:val="18"/>
-                <w:szCs w:val="18"/>
-                <w:lang w:eastAsia="pt-BR"/>
-              </w:rPr>
-              <w:t xml:space="preserve">: </w:t>
-            </w:r>
-            <w:r>
-              <w:rPr>
-                <w:rFonts w:ascii="Century Gothic" w:hAnsi="Century Gothic" w:cs="Calibri"/>
-                <w:sz w:val="18"/>
-                <w:szCs w:val="18"/>
-                <w:lang w:eastAsia="pt-BR"/>
-              </w:rPr>
-              <w:t>11013-310</w:t>
-            </w:r>
-            <w:r>
-              <w:rPr>
-                <w:rFonts w:ascii="Century Gothic" w:hAnsi="Century Gothic" w:cs="Calibri"/>
-                <w:sz w:val="18"/>
-                <w:szCs w:val="18"/>
-                <w:lang w:eastAsia="pt-BR"/>
-              </w:rPr>
-              <w:t xml:space="preserve">    </w:t>
-            </w:r>
-          </w:p>
-          <w:p>
-            <w:pPr>
-              <w:spacing w:after="0"/>
-              <w:rPr>
-                <w:rFonts w:ascii="Century Gothic" w:hAnsi="Century Gothic" w:cs="Calibri"/>
-                <w:sz w:val="18"/>
-                <w:szCs w:val="18"/>
-                <w:lang w:eastAsia="pt-BR"/>
-              </w:rPr>
-            </w:pPr>
-            <w:r>
-              <w:rPr>
-                <w:rFonts w:ascii="Times New Roman" w:eastAsia="Times New Roman" w:hAnsi="Times New Roman" w:cs="Times New Roman"/>
-                <w:sz w:val="24"/>
-                <w:szCs w:val="24"/>
-                <w:lang w:eastAsia="pt-BR"/>
-              </w:rPr>
-              <w:t xml:space="preserve">                                </w:t>
-            </w:r>
-            <w:r>
-              <w:rPr>
-                <w:rFonts w:ascii="Century Gothic" w:hAnsi="Century Gothic" w:cs="Calibri"/>
-                <w:sz w:val="18"/>
-                <w:szCs w:val="18"/>
-                <w:lang w:eastAsia="pt-BR"/>
-              </w:rPr>
-              <w:t>Tel.</w:t>
-            </w:r>
-            <w:proofErr w:type="gramStart"/>
-            <w:r>
-              <w:rPr>
-                <w:rFonts w:ascii="Century Gothic" w:hAnsi="Century Gothic" w:cs="Calibri"/>
-                <w:sz w:val="18"/>
-                <w:szCs w:val="18"/>
-                <w:lang w:eastAsia="pt-BR"/>
-              </w:rPr>
-              <w:t>:  (</w:t>
-            </w:r>
-            <w:proofErr w:type="gramEnd"/>
-            <w:r>
-              <w:rPr>
-                <w:rFonts w:ascii="Century Gothic" w:hAnsi="Century Gothic" w:cs="Calibri"/>
-                <w:sz w:val="18"/>
-                <w:szCs w:val="18"/>
-                <w:lang w:eastAsia="pt-BR"/>
-              </w:rPr>
-              <w:t xml:space="preserve">13) 3385-8481 - (13) 98816-2379  </w:t>
+              <w:t xml:space="preserve">Tel.:  (13) 3385-8481 - (13) 98816-2379  </w:t>
             </w:r>
           </w:p>
           <w:p>
@@ -3096,34 +2030,7 @@
                 <w:szCs w:val="18"/>
                 <w:lang w:val="en-US" w:eastAsia="pt-BR"/>
               </w:rPr>
-              <w:t>CNPJ: 41.560.212/000</w:t>
-            </w:r>
-            <w:r>
-              <w:rPr>
-                <w:rFonts w:ascii="Century Gothic" w:hAnsi="Century Gothic" w:cs="Calibri"/>
-                <w:sz w:val="18"/>
-                <w:szCs w:val="18"/>
-                <w:lang w:val="en-US" w:eastAsia="pt-BR"/>
-              </w:rPr>
-              <w:t>2</w:t>
-            </w:r>
-            <w:r>
-              <w:rPr>
-                <w:rFonts w:ascii="Century Gothic" w:hAnsi="Century Gothic" w:cs="Calibri"/>
-                <w:sz w:val="18"/>
-                <w:szCs w:val="18"/>
-                <w:lang w:val="en-US" w:eastAsia="pt-BR"/>
-              </w:rPr>
-              <w:t xml:space="preserve"> – </w:t>
-            </w:r>
-            <w:r>
-              <w:rPr>
-                <w:rFonts w:ascii="Century Gothic" w:hAnsi="Century Gothic" w:cs="Calibri"/>
-                <w:sz w:val="18"/>
-                <w:szCs w:val="18"/>
-                <w:lang w:val="en-US" w:eastAsia="pt-BR"/>
-              </w:rPr>
-              <w:t>91</w:t>
+              <w:t xml:space="preserve">CNPJ: 41.560.212/0002 – 91</w:t>
             </w:r>
           </w:p>
         </w:tc>

</xml_diff>